<commit_message>
added presentation to docs
</commit_message>
<xml_diff>
--- a/documentation/Kummerkasten.docx
+++ b/documentation/Kummerkasten.docx
@@ -601,26 +601,27 @@
     </w:p>
     <w:sdt>
       <w:sdtPr>
-        <w:rPr>
-          <w:lang w:eastAsia="en-US"/>
-        </w:rPr>
         <w:id w:val="1103846591"/>
         <w:docPartObj>
           <w:docPartGallery w:val="Table of Contents"/>
           <w:docPartUnique/>
         </w:docPartObj>
       </w:sdtPr>
-      <w:sdtEndPr/>
       <w:sdtContent>
         <w:p>
           <w:pPr>
-            <w:pStyle w:val="Inhaltsverzeichnisberschrift"/>
+            <w:pStyle w:val="berschrift1"/>
           </w:pPr>
           <w:r>
             <w:t>Inhalt</w:t>
           </w:r>
           <w:r>
-            <w:t>sverzeichnis</w:t>
+            <w:t>sverzei</w:t>
+          </w:r>
+          <w:bookmarkStart w:id="0" w:name="_GoBack"/>
+          <w:bookmarkEnd w:id="0"/>
+          <w:r>
+            <w:t>chnis</w:t>
           </w:r>
         </w:p>
         <w:p>
@@ -645,7 +646,7 @@
           <w:r>
             <w:fldChar w:fldCharType="separate"/>
           </w:r>
-          <w:hyperlink w:anchor="_Toc243560824" w:history="1">
+          <w:hyperlink w:anchor="_Toc244076015" w:history="1">
             <w:r>
               <w:rPr>
                 <w:rStyle w:val="Hyperlink"/>
@@ -692,7 +693,7 @@
                 <w:noProof/>
                 <w:webHidden/>
               </w:rPr>
-              <w:instrText xml:space="preserve"> PAGEREF _Toc243560824 \h </w:instrText>
+              <w:instrText xml:space="preserve"> PAGEREF _Toc244076015 \h </w:instrText>
             </w:r>
             <w:r>
               <w:rPr>
@@ -736,7 +737,7 @@
               <w:lang w:eastAsia="de-DE"/>
             </w:rPr>
           </w:pPr>
-          <w:hyperlink w:anchor="_Toc243560825" w:history="1">
+          <w:hyperlink w:anchor="_Toc244076016" w:history="1">
             <w:r>
               <w:rPr>
                 <w:rStyle w:val="Hyperlink"/>
@@ -783,7 +784,7 @@
                 <w:noProof/>
                 <w:webHidden/>
               </w:rPr>
-              <w:instrText xml:space="preserve"> PAGEREF _Toc243560825 \h </w:instrText>
+              <w:instrText xml:space="preserve"> PAGEREF _Toc244076016 \h </w:instrText>
             </w:r>
             <w:r>
               <w:rPr>
@@ -827,7 +828,7 @@
               <w:lang w:eastAsia="de-DE"/>
             </w:rPr>
           </w:pPr>
-          <w:hyperlink w:anchor="_Toc243560826" w:history="1">
+          <w:hyperlink w:anchor="_Toc244076017" w:history="1">
             <w:r>
               <w:rPr>
                 <w:rStyle w:val="Hyperlink"/>
@@ -874,7 +875,7 @@
                 <w:noProof/>
                 <w:webHidden/>
               </w:rPr>
-              <w:instrText xml:space="preserve"> PAGEREF _Toc243560826 \h </w:instrText>
+              <w:instrText xml:space="preserve"> PAGEREF _Toc244076017 \h </w:instrText>
             </w:r>
             <w:r>
               <w:rPr>
@@ -919,7 +920,7 @@
               <w:lang w:eastAsia="de-DE"/>
             </w:rPr>
           </w:pPr>
-          <w:hyperlink w:anchor="_Toc243560827" w:history="1">
+          <w:hyperlink w:anchor="_Toc244076018" w:history="1">
             <w:r>
               <w:rPr>
                 <w:rStyle w:val="Hyperlink"/>
@@ -966,7 +967,7 @@
                 <w:noProof/>
                 <w:webHidden/>
               </w:rPr>
-              <w:instrText xml:space="preserve"> PAGEREF _Toc243560827 \h </w:instrText>
+              <w:instrText xml:space="preserve"> PAGEREF _Toc244076018 \h </w:instrText>
             </w:r>
             <w:r>
               <w:rPr>
@@ -1011,7 +1012,7 @@
               <w:lang w:eastAsia="de-DE"/>
             </w:rPr>
           </w:pPr>
-          <w:hyperlink w:anchor="_Toc243560828" w:history="1">
+          <w:hyperlink w:anchor="_Toc244076019" w:history="1">
             <w:r>
               <w:rPr>
                 <w:rStyle w:val="Hyperlink"/>
@@ -1056,7 +1057,7 @@
                 <w:noProof/>
                 <w:webHidden/>
               </w:rPr>
-              <w:instrText xml:space="preserve"> PAGEREF _Toc243560828 \h </w:instrText>
+              <w:instrText xml:space="preserve"> PAGEREF _Toc244076019 \h </w:instrText>
             </w:r>
             <w:r>
               <w:rPr>
@@ -1100,7 +1101,7 @@
               <w:lang w:eastAsia="de-DE"/>
             </w:rPr>
           </w:pPr>
-          <w:hyperlink w:anchor="_Toc243560829" w:history="1">
+          <w:hyperlink w:anchor="_Toc244076020" w:history="1">
             <w:r>
               <w:rPr>
                 <w:rStyle w:val="Hyperlink"/>
@@ -1145,7 +1146,7 @@
                 <w:noProof/>
                 <w:webHidden/>
               </w:rPr>
-              <w:instrText xml:space="preserve"> PAGEREF _Toc243560829 \h </w:instrText>
+              <w:instrText xml:space="preserve"> PAGEREF _Toc244076020 \h </w:instrText>
             </w:r>
             <w:r>
               <w:rPr>
@@ -1189,7 +1190,7 @@
               <w:lang w:eastAsia="de-DE"/>
             </w:rPr>
           </w:pPr>
-          <w:hyperlink w:anchor="_Toc243560830" w:history="1">
+          <w:hyperlink w:anchor="_Toc244076021" w:history="1">
             <w:r>
               <w:rPr>
                 <w:rStyle w:val="Hyperlink"/>
@@ -1236,7 +1237,7 @@
                 <w:noProof/>
                 <w:webHidden/>
               </w:rPr>
-              <w:instrText xml:space="preserve"> PAGEREF _Toc243560830 \h </w:instrText>
+              <w:instrText xml:space="preserve"> PAGEREF _Toc244076021 \h </w:instrText>
             </w:r>
             <w:r>
               <w:rPr>
@@ -1281,7 +1282,7 @@
               <w:lang w:eastAsia="de-DE"/>
             </w:rPr>
           </w:pPr>
-          <w:hyperlink w:anchor="_Toc243560831" w:history="1">
+          <w:hyperlink w:anchor="_Toc244076022" w:history="1">
             <w:r>
               <w:rPr>
                 <w:rStyle w:val="Hyperlink"/>
@@ -1326,7 +1327,7 @@
                 <w:noProof/>
                 <w:webHidden/>
               </w:rPr>
-              <w:instrText xml:space="preserve"> PAGEREF _Toc243560831 \h </w:instrText>
+              <w:instrText xml:space="preserve"> PAGEREF _Toc244076022 \h </w:instrText>
             </w:r>
             <w:r>
               <w:rPr>
@@ -1371,7 +1372,7 @@
               <w:lang w:eastAsia="de-DE"/>
             </w:rPr>
           </w:pPr>
-          <w:hyperlink w:anchor="_Toc243560832" w:history="1">
+          <w:hyperlink w:anchor="_Toc244076023" w:history="1">
             <w:r>
               <w:rPr>
                 <w:rStyle w:val="Hyperlink"/>
@@ -1416,7 +1417,7 @@
                 <w:noProof/>
                 <w:webHidden/>
               </w:rPr>
-              <w:instrText xml:space="preserve"> PAGEREF _Toc243560832 \h </w:instrText>
+              <w:instrText xml:space="preserve"> PAGEREF _Toc244076023 \h </w:instrText>
             </w:r>
             <w:r>
               <w:rPr>
@@ -1460,7 +1461,7 @@
               <w:lang w:eastAsia="de-DE"/>
             </w:rPr>
           </w:pPr>
-          <w:hyperlink w:anchor="_Toc243560833" w:history="1">
+          <w:hyperlink w:anchor="_Toc244076024" w:history="1">
             <w:r>
               <w:rPr>
                 <w:rStyle w:val="Hyperlink"/>
@@ -1507,7 +1508,7 @@
                 <w:noProof/>
                 <w:webHidden/>
               </w:rPr>
-              <w:instrText xml:space="preserve"> PAGEREF _Toc243560833 \h </w:instrText>
+              <w:instrText xml:space="preserve"> PAGEREF _Toc244076024 \h </w:instrText>
             </w:r>
             <w:r>
               <w:rPr>
@@ -1551,7 +1552,7 @@
               <w:lang w:eastAsia="de-DE"/>
             </w:rPr>
           </w:pPr>
-          <w:hyperlink w:anchor="_Toc243560834" w:history="1">
+          <w:hyperlink w:anchor="_Toc244076025" w:history="1">
             <w:r>
               <w:rPr>
                 <w:rStyle w:val="Hyperlink"/>
@@ -1598,7 +1599,7 @@
                 <w:noProof/>
                 <w:webHidden/>
               </w:rPr>
-              <w:instrText xml:space="preserve"> PAGEREF _Toc243560834 \h </w:instrText>
+              <w:instrText xml:space="preserve"> PAGEREF _Toc244076025 \h </w:instrText>
             </w:r>
             <w:r>
               <w:rPr>
@@ -1642,7 +1643,7 @@
               <w:lang w:eastAsia="de-DE"/>
             </w:rPr>
           </w:pPr>
-          <w:hyperlink w:anchor="_Toc243560835" w:history="1">
+          <w:hyperlink w:anchor="_Toc244076026" w:history="1">
             <w:r>
               <w:rPr>
                 <w:rStyle w:val="Hyperlink"/>
@@ -1689,7 +1690,7 @@
                 <w:noProof/>
                 <w:webHidden/>
               </w:rPr>
-              <w:instrText xml:space="preserve"> PAGEREF _Toc243560835 \h </w:instrText>
+              <w:instrText xml:space="preserve"> PAGEREF _Toc244076026 \h </w:instrText>
             </w:r>
             <w:r>
               <w:rPr>
@@ -1733,7 +1734,7 @@
               <w:lang w:eastAsia="de-DE"/>
             </w:rPr>
           </w:pPr>
-          <w:hyperlink w:anchor="_Toc243560836" w:history="1">
+          <w:hyperlink w:anchor="_Toc244076027" w:history="1">
             <w:r>
               <w:rPr>
                 <w:rStyle w:val="Hyperlink"/>
@@ -1780,7 +1781,7 @@
                 <w:noProof/>
                 <w:webHidden/>
               </w:rPr>
-              <w:instrText xml:space="preserve"> PAGEREF _Toc243560836 \h </w:instrText>
+              <w:instrText xml:space="preserve"> PAGEREF _Toc244076027 \h </w:instrText>
             </w:r>
             <w:r>
               <w:rPr>
@@ -1824,7 +1825,7 @@
               <w:lang w:eastAsia="de-DE"/>
             </w:rPr>
           </w:pPr>
-          <w:hyperlink w:anchor="_Toc243560837" w:history="1">
+          <w:hyperlink w:anchor="_Toc244076028" w:history="1">
             <w:r>
               <w:rPr>
                 <w:rStyle w:val="Hyperlink"/>
@@ -1871,7 +1872,7 @@
                 <w:noProof/>
                 <w:webHidden/>
               </w:rPr>
-              <w:instrText xml:space="preserve"> PAGEREF _Toc243560837 \h </w:instrText>
+              <w:instrText xml:space="preserve"> PAGEREF _Toc244076028 \h </w:instrText>
             </w:r>
             <w:r>
               <w:rPr>
@@ -1915,7 +1916,7 @@
               <w:lang w:eastAsia="de-DE"/>
             </w:rPr>
           </w:pPr>
-          <w:hyperlink w:anchor="_Toc243560838" w:history="1">
+          <w:hyperlink w:anchor="_Toc244076029" w:history="1">
             <w:r>
               <w:rPr>
                 <w:rStyle w:val="Hyperlink"/>
@@ -1962,7 +1963,7 @@
                 <w:noProof/>
                 <w:webHidden/>
               </w:rPr>
-              <w:instrText xml:space="preserve"> PAGEREF _Toc243560838 \h </w:instrText>
+              <w:instrText xml:space="preserve"> PAGEREF _Toc244076029 \h </w:instrText>
             </w:r>
             <w:r>
               <w:rPr>
@@ -2006,7 +2007,7 @@
               <w:lang w:eastAsia="de-DE"/>
             </w:rPr>
           </w:pPr>
-          <w:hyperlink w:anchor="_Toc243560839" w:history="1">
+          <w:hyperlink w:anchor="_Toc244076030" w:history="1">
             <w:r>
               <w:rPr>
                 <w:rStyle w:val="Hyperlink"/>
@@ -2053,7 +2054,7 @@
                 <w:noProof/>
                 <w:webHidden/>
               </w:rPr>
-              <w:instrText xml:space="preserve"> PAGEREF _Toc243560839 \h </w:instrText>
+              <w:instrText xml:space="preserve"> PAGEREF _Toc244076030 \h </w:instrText>
             </w:r>
             <w:r>
               <w:rPr>
@@ -2097,7 +2098,7 @@
               <w:lang w:eastAsia="de-DE"/>
             </w:rPr>
           </w:pPr>
-          <w:hyperlink w:anchor="_Toc243560840" w:history="1">
+          <w:hyperlink w:anchor="_Toc244076031" w:history="1">
             <w:r>
               <w:rPr>
                 <w:rStyle w:val="Hyperlink"/>
@@ -2123,7 +2124,7 @@
                 <w:noProof/>
                 <w:lang w:eastAsia="de-DE"/>
               </w:rPr>
-              <w:t>Anonymisierung und Datenschutz</w:t>
+              <w:t>Technisches Konzept</w:t>
             </w:r>
             <w:r>
               <w:rPr>
@@ -2144,7 +2145,7 @@
                 <w:noProof/>
                 <w:webHidden/>
               </w:rPr>
-              <w:instrText xml:space="preserve"> PAGEREF _Toc243560840 \h </w:instrText>
+              <w:instrText xml:space="preserve"> PAGEREF _Toc244076031 \h </w:instrText>
             </w:r>
             <w:r>
               <w:rPr>
@@ -2188,7 +2189,7 @@
               <w:lang w:eastAsia="de-DE"/>
             </w:rPr>
           </w:pPr>
-          <w:hyperlink w:anchor="_Toc243560841" w:history="1">
+          <w:hyperlink w:anchor="_Toc244076032" w:history="1">
             <w:r>
               <w:rPr>
                 <w:rStyle w:val="Hyperlink"/>
@@ -2235,7 +2236,7 @@
                 <w:noProof/>
                 <w:webHidden/>
               </w:rPr>
-              <w:instrText xml:space="preserve"> PAGEREF _Toc243560841 \h </w:instrText>
+              <w:instrText xml:space="preserve"> PAGEREF _Toc244076032 \h </w:instrText>
             </w:r>
             <w:r>
               <w:rPr>
@@ -2279,7 +2280,7 @@
               <w:lang w:eastAsia="de-DE"/>
             </w:rPr>
           </w:pPr>
-          <w:hyperlink w:anchor="_Toc243560842" w:history="1">
+          <w:hyperlink w:anchor="_Toc244076033" w:history="1">
             <w:r>
               <w:rPr>
                 <w:rStyle w:val="Hyperlink"/>
@@ -2326,7 +2327,7 @@
                 <w:noProof/>
                 <w:webHidden/>
               </w:rPr>
-              <w:instrText xml:space="preserve"> PAGEREF _Toc243560842 \h </w:instrText>
+              <w:instrText xml:space="preserve"> PAGEREF _Toc244076033 \h </w:instrText>
             </w:r>
             <w:r>
               <w:rPr>
@@ -2346,7 +2347,7 @@
                 <w:noProof/>
                 <w:webHidden/>
               </w:rPr>
-              <w:t>10</w:t>
+              <w:t>11</w:t>
             </w:r>
             <w:r>
               <w:rPr>
@@ -2370,7 +2371,7 @@
               <w:lang w:eastAsia="de-DE"/>
             </w:rPr>
           </w:pPr>
-          <w:hyperlink w:anchor="_Toc243560843" w:history="1">
+          <w:hyperlink w:anchor="_Toc244076034" w:history="1">
             <w:r>
               <w:rPr>
                 <w:rStyle w:val="Hyperlink"/>
@@ -2417,7 +2418,7 @@
                 <w:noProof/>
                 <w:webHidden/>
               </w:rPr>
-              <w:instrText xml:space="preserve"> PAGEREF _Toc243560843 \h </w:instrText>
+              <w:instrText xml:space="preserve"> PAGEREF _Toc244076034 \h </w:instrText>
             </w:r>
             <w:r>
               <w:rPr>
@@ -2437,7 +2438,7 @@
                 <w:noProof/>
                 <w:webHidden/>
               </w:rPr>
-              <w:t>10</w:t>
+              <w:t>11</w:t>
             </w:r>
             <w:r>
               <w:rPr>
@@ -2461,7 +2462,7 @@
               <w:lang w:eastAsia="de-DE"/>
             </w:rPr>
           </w:pPr>
-          <w:hyperlink w:anchor="_Toc243560844" w:history="1">
+          <w:hyperlink w:anchor="_Toc244076035" w:history="1">
             <w:r>
               <w:rPr>
                 <w:rStyle w:val="Hyperlink"/>
@@ -2508,7 +2509,7 @@
                 <w:noProof/>
                 <w:webHidden/>
               </w:rPr>
-              <w:instrText xml:space="preserve"> PAGEREF _Toc243560844 \h </w:instrText>
+              <w:instrText xml:space="preserve"> PAGEREF _Toc244076035 \h </w:instrText>
             </w:r>
             <w:r>
               <w:rPr>
@@ -2528,7 +2529,7 @@
                 <w:noProof/>
                 <w:webHidden/>
               </w:rPr>
-              <w:t>10</w:t>
+              <w:t>11</w:t>
             </w:r>
             <w:r>
               <w:rPr>
@@ -2552,7 +2553,7 @@
               <w:lang w:eastAsia="de-DE"/>
             </w:rPr>
           </w:pPr>
-          <w:hyperlink w:anchor="_Toc243560845" w:history="1">
+          <w:hyperlink w:anchor="_Toc244076036" w:history="1">
             <w:r>
               <w:rPr>
                 <w:rStyle w:val="Hyperlink"/>
@@ -2599,7 +2600,7 @@
                 <w:noProof/>
                 <w:webHidden/>
               </w:rPr>
-              <w:instrText xml:space="preserve"> PAGEREF _Toc243560845 \h </w:instrText>
+              <w:instrText xml:space="preserve"> PAGEREF _Toc244076036 \h </w:instrText>
             </w:r>
             <w:r>
               <w:rPr>
@@ -2619,7 +2620,7 @@
                 <w:noProof/>
                 <w:webHidden/>
               </w:rPr>
-              <w:t>10</w:t>
+              <w:t>11</w:t>
             </w:r>
             <w:r>
               <w:rPr>
@@ -2643,7 +2644,7 @@
               <w:lang w:eastAsia="de-DE"/>
             </w:rPr>
           </w:pPr>
-          <w:hyperlink w:anchor="_Toc243560846" w:history="1">
+          <w:hyperlink w:anchor="_Toc244076037" w:history="1">
             <w:r>
               <w:rPr>
                 <w:rStyle w:val="Hyperlink"/>
@@ -2690,7 +2691,7 @@
                 <w:noProof/>
                 <w:webHidden/>
               </w:rPr>
-              <w:instrText xml:space="preserve"> PAGEREF _Toc243560846 \h </w:instrText>
+              <w:instrText xml:space="preserve"> PAGEREF _Toc244076037 \h </w:instrText>
             </w:r>
             <w:r>
               <w:rPr>
@@ -2710,7 +2711,7 @@
                 <w:noProof/>
                 <w:webHidden/>
               </w:rPr>
-              <w:t>10</w:t>
+              <w:t>11</w:t>
             </w:r>
             <w:r>
               <w:rPr>
@@ -2734,7 +2735,7 @@
               <w:lang w:eastAsia="de-DE"/>
             </w:rPr>
           </w:pPr>
-          <w:hyperlink w:anchor="_Toc243560847" w:history="1">
+          <w:hyperlink w:anchor="_Toc244076038" w:history="1">
             <w:r>
               <w:rPr>
                 <w:rStyle w:val="Hyperlink"/>
@@ -2781,7 +2782,7 @@
                 <w:noProof/>
                 <w:webHidden/>
               </w:rPr>
-              <w:instrText xml:space="preserve"> PAGEREF _Toc243560847 \h </w:instrText>
+              <w:instrText xml:space="preserve"> PAGEREF _Toc244076038 \h </w:instrText>
             </w:r>
             <w:r>
               <w:rPr>
@@ -2801,7 +2802,7 @@
                 <w:noProof/>
                 <w:webHidden/>
               </w:rPr>
-              <w:t>10</w:t>
+              <w:t>11</w:t>
             </w:r>
             <w:r>
               <w:rPr>
@@ -2825,7 +2826,7 @@
               <w:lang w:eastAsia="de-DE"/>
             </w:rPr>
           </w:pPr>
-          <w:hyperlink w:anchor="_Toc243560848" w:history="1">
+          <w:hyperlink w:anchor="_Toc244076039" w:history="1">
             <w:r>
               <w:rPr>
                 <w:rStyle w:val="Hyperlink"/>
@@ -2872,7 +2873,7 @@
                 <w:noProof/>
                 <w:webHidden/>
               </w:rPr>
-              <w:instrText xml:space="preserve"> PAGEREF _Toc243560848 \h </w:instrText>
+              <w:instrText xml:space="preserve"> PAGEREF _Toc244076039 \h </w:instrText>
             </w:r>
             <w:r>
               <w:rPr>
@@ -2892,7 +2893,7 @@
                 <w:noProof/>
                 <w:webHidden/>
               </w:rPr>
-              <w:t>10</w:t>
+              <w:t>11</w:t>
             </w:r>
             <w:r>
               <w:rPr>
@@ -2916,7 +2917,7 @@
               <w:lang w:eastAsia="de-DE"/>
             </w:rPr>
           </w:pPr>
-          <w:hyperlink w:anchor="_Toc243560849" w:history="1">
+          <w:hyperlink w:anchor="_Toc244076040" w:history="1">
             <w:r>
               <w:rPr>
                 <w:rStyle w:val="Hyperlink"/>
@@ -2963,7 +2964,7 @@
                 <w:noProof/>
                 <w:webHidden/>
               </w:rPr>
-              <w:instrText xml:space="preserve"> PAGEREF _Toc243560849 \h </w:instrText>
+              <w:instrText xml:space="preserve"> PAGEREF _Toc244076040 \h </w:instrText>
             </w:r>
             <w:r>
               <w:rPr>
@@ -2983,7 +2984,7 @@
                 <w:noProof/>
                 <w:webHidden/>
               </w:rPr>
-              <w:t>10</w:t>
+              <w:t>11</w:t>
             </w:r>
             <w:r>
               <w:rPr>
@@ -3007,7 +3008,7 @@
               <w:lang w:eastAsia="de-DE"/>
             </w:rPr>
           </w:pPr>
-          <w:hyperlink w:anchor="_Toc243560850" w:history="1">
+          <w:hyperlink w:anchor="_Toc244076041" w:history="1">
             <w:r>
               <w:rPr>
                 <w:rStyle w:val="Hyperlink"/>
@@ -3054,7 +3055,7 @@
                 <w:noProof/>
                 <w:webHidden/>
               </w:rPr>
-              <w:instrText xml:space="preserve"> PAGEREF _Toc243560850 \h </w:instrText>
+              <w:instrText xml:space="preserve"> PAGEREF _Toc244076041 \h </w:instrText>
             </w:r>
             <w:r>
               <w:rPr>
@@ -3074,7 +3075,7 @@
                 <w:noProof/>
                 <w:webHidden/>
               </w:rPr>
-              <w:t>11</w:t>
+              <w:t>12</w:t>
             </w:r>
             <w:r>
               <w:rPr>
@@ -3098,7 +3099,7 @@
               <w:lang w:eastAsia="de-DE"/>
             </w:rPr>
           </w:pPr>
-          <w:hyperlink w:anchor="_Toc243560851" w:history="1">
+          <w:hyperlink w:anchor="_Toc244076042" w:history="1">
             <w:r>
               <w:rPr>
                 <w:rStyle w:val="Hyperlink"/>
@@ -3145,7 +3146,7 @@
                 <w:noProof/>
                 <w:webHidden/>
               </w:rPr>
-              <w:instrText xml:space="preserve"> PAGEREF _Toc243560851 \h </w:instrText>
+              <w:instrText xml:space="preserve"> PAGEREF _Toc244076042 \h </w:instrText>
             </w:r>
             <w:r>
               <w:rPr>
@@ -3165,7 +3166,7 @@
                 <w:noProof/>
                 <w:webHidden/>
               </w:rPr>
-              <w:t>11</w:t>
+              <w:t>12</w:t>
             </w:r>
             <w:r>
               <w:rPr>
@@ -3189,7 +3190,7 @@
               <w:lang w:eastAsia="de-DE"/>
             </w:rPr>
           </w:pPr>
-          <w:hyperlink w:anchor="_Toc243560852" w:history="1">
+          <w:hyperlink w:anchor="_Toc244076043" w:history="1">
             <w:r>
               <w:rPr>
                 <w:rStyle w:val="Hyperlink"/>
@@ -3236,7 +3237,7 @@
                 <w:noProof/>
                 <w:webHidden/>
               </w:rPr>
-              <w:instrText xml:space="preserve"> PAGEREF _Toc243560852 \h </w:instrText>
+              <w:instrText xml:space="preserve"> PAGEREF _Toc244076043 \h </w:instrText>
             </w:r>
             <w:r>
               <w:rPr>
@@ -3256,7 +3257,7 @@
                 <w:noProof/>
                 <w:webHidden/>
               </w:rPr>
-              <w:t>11</w:t>
+              <w:t>12</w:t>
             </w:r>
             <w:r>
               <w:rPr>
@@ -3280,7 +3281,7 @@
               <w:lang w:eastAsia="de-DE"/>
             </w:rPr>
           </w:pPr>
-          <w:hyperlink w:anchor="_Toc243560853" w:history="1">
+          <w:hyperlink w:anchor="_Toc244076044" w:history="1">
             <w:r>
               <w:rPr>
                 <w:rStyle w:val="Hyperlink"/>
@@ -3325,7 +3326,7 @@
                 <w:noProof/>
                 <w:webHidden/>
               </w:rPr>
-              <w:instrText xml:space="preserve"> PAGEREF _Toc243560853 \h </w:instrText>
+              <w:instrText xml:space="preserve"> PAGEREF _Toc244076044 \h </w:instrText>
             </w:r>
             <w:r>
               <w:rPr>
@@ -3345,7 +3346,7 @@
                 <w:noProof/>
                 <w:webHidden/>
               </w:rPr>
-              <w:t>12</w:t>
+              <w:t>13</w:t>
             </w:r>
             <w:r>
               <w:rPr>
@@ -3369,7 +3370,7 @@
               <w:lang w:eastAsia="de-DE"/>
             </w:rPr>
           </w:pPr>
-          <w:hyperlink w:anchor="_Toc243560854" w:history="1">
+          <w:hyperlink w:anchor="_Toc244076045" w:history="1">
             <w:r>
               <w:rPr>
                 <w:rStyle w:val="Hyperlink"/>
@@ -3416,7 +3417,7 @@
                 <w:noProof/>
                 <w:webHidden/>
               </w:rPr>
-              <w:instrText xml:space="preserve"> PAGEREF _Toc243560854 \h </w:instrText>
+              <w:instrText xml:space="preserve"> PAGEREF _Toc244076045 \h </w:instrText>
             </w:r>
             <w:r>
               <w:rPr>
@@ -3436,7 +3437,7 @@
                 <w:noProof/>
                 <w:webHidden/>
               </w:rPr>
-              <w:t>12</w:t>
+              <w:t>13</w:t>
             </w:r>
             <w:r>
               <w:rPr>
@@ -3460,7 +3461,7 @@
               <w:lang w:eastAsia="de-DE"/>
             </w:rPr>
           </w:pPr>
-          <w:hyperlink w:anchor="_Toc243560855" w:history="1">
+          <w:hyperlink w:anchor="_Toc244076046" w:history="1">
             <w:r>
               <w:rPr>
                 <w:rStyle w:val="Hyperlink"/>
@@ -3507,7 +3508,7 @@
                 <w:noProof/>
                 <w:webHidden/>
               </w:rPr>
-              <w:instrText xml:space="preserve"> PAGEREF _Toc243560855 \h </w:instrText>
+              <w:instrText xml:space="preserve"> PAGEREF _Toc244076046 \h </w:instrText>
             </w:r>
             <w:r>
               <w:rPr>
@@ -3527,7 +3528,7 @@
                 <w:noProof/>
                 <w:webHidden/>
               </w:rPr>
-              <w:t>12</w:t>
+              <w:t>13</w:t>
             </w:r>
             <w:r>
               <w:rPr>
@@ -3576,176 +3577,163 @@
           <w:lang w:eastAsia="de-DE"/>
         </w:rPr>
       </w:pPr>
-      <w:bookmarkStart w:id="0" w:name="_Toc243560824"/>
+      <w:bookmarkStart w:id="1" w:name="_Toc244076015"/>
       <w:r>
         <w:rPr>
           <w:rFonts w:eastAsia="Times New Roman"/>
           <w:lang w:eastAsia="de-DE"/>
         </w:rPr>
         <w:t>Projektbeschreibung</w:t>
-      </w:r>
-      <w:bookmarkEnd w:id="0"/>
-    </w:p>
-    <w:p>
-      <w:pPr>
-        <w:pStyle w:val="berschrift2"/>
-        <w:rPr>
-          <w:rFonts w:eastAsia="Times New Roman"/>
-          <w:lang w:eastAsia="de-DE"/>
-        </w:rPr>
-      </w:pPr>
-      <w:bookmarkStart w:id="1" w:name="_Toc243560825"/>
-      <w:r>
-        <w:rPr>
-          <w:rFonts w:eastAsia="Times New Roman"/>
-          <w:lang w:eastAsia="de-DE"/>
-        </w:rPr>
-        <w:t>Ausgangssituation</w:t>
       </w:r>
       <w:bookmarkEnd w:id="1"/>
     </w:p>
     <w:p>
       <w:pPr>
-        <w:rPr>
-          <w:lang w:eastAsia="de-DE"/>
-        </w:rPr>
-      </w:pPr>
-      <w:r>
-        <w:rPr>
-          <w:lang w:eastAsia="de-DE"/>
-        </w:rPr>
-        <w:t>In den Gebäuden und Gruppen der Jugendhilfe der Diakonie Hochfranken gab es bisher einen physischen Kummerkasten, über den Jugendliche Anliegen, Sorgen und Rückmeldungen einreichen konnten. Auftraggeber des Projekts ist Herr Proksch als Leitung der Jugendhilfe. Die Umsetzung erfolgt durch Dana Günsche im Rahmen ihrer Ausbildung zur Fachinformatikerin für Anwendungsentwicklung. Der physische Kummerkasten sollte durch eine digitale Lösung ersetzt werden.</w:t>
-      </w:r>
-    </w:p>
-    <w:p>
-      <w:pPr>
-        <w:rPr>
-          <w:lang w:eastAsia="de-DE"/>
-        </w:rPr>
-      </w:pPr>
-      <w:r>
-        <w:rPr>
-          <w:lang w:eastAsia="de-DE"/>
-        </w:rPr>
-        <w:t>Dafür wurde zunächst ein Webformular mit E-Mail-Versand entwickelt. Der Versand lief über einen externen E-Mail-Dienstleister. Aus datenschutzrechtlicher Sicht ist das kritisch, da Nachrichteninhalte durch e</w:t>
-      </w:r>
-      <w:r>
-        <w:rPr>
-          <w:lang w:eastAsia="de-DE"/>
-        </w:rPr>
-        <w:t xml:space="preserve">inen Dritten verarbeitet werden. </w:t>
-      </w:r>
-      <w:r>
-        <w:rPr>
-          <w:lang w:eastAsia="de-DE"/>
-        </w:rPr>
-        <w:t xml:space="preserve">Zu einem produktiven Einsatz kam es nicht, weil die Abstimmung mit der IT-Abteilung zu </w:t>
-      </w:r>
-      <w:proofErr w:type="spellStart"/>
-      <w:r>
-        <w:rPr>
-          <w:lang w:eastAsia="de-DE"/>
-        </w:rPr>
-        <w:t>Deployment</w:t>
-      </w:r>
-      <w:proofErr w:type="spellEnd"/>
-      <w:r>
-        <w:rPr>
-          <w:lang w:eastAsia="de-DE"/>
-        </w:rPr>
-        <w:t xml:space="preserve"> und Betrieb nicht abgeschlossen werden konnte.</w:t>
-      </w:r>
-    </w:p>
-    <w:p>
-      <w:pPr>
-        <w:rPr>
-          <w:lang w:eastAsia="de-DE"/>
-        </w:rPr>
-      </w:pPr>
-      <w:r>
-        <w:rPr>
-          <w:lang w:eastAsia="de-DE"/>
-        </w:rPr>
-        <w:t xml:space="preserve">Nach einer Pause wurde das Projekt </w:t>
-      </w:r>
-      <w:proofErr w:type="gramStart"/>
-      <w:r>
-        <w:rPr>
-          <w:lang w:eastAsia="de-DE"/>
-        </w:rPr>
-        <w:t>wieder aufgenommen</w:t>
-      </w:r>
-      <w:proofErr w:type="gramEnd"/>
-      <w:r>
-        <w:rPr>
-          <w:lang w:eastAsia="de-DE"/>
-        </w:rPr>
-        <w:t xml:space="preserve">. In einem Gespräch mit Herrn Proksch im April 2026 wurden die Anforderungen vertieft und erweitert (u. a. Auswahl einer Ansprechperson, Zuordnung zu Haus/Gruppe, Mehrsprachigkeit, positive Rückmeldungen). Offen blieb weiterhin die Abstimmung mit der IT-Abteilung zu einem </w:t>
-      </w:r>
-      <w:proofErr w:type="spellStart"/>
-      <w:r>
-        <w:rPr>
-          <w:lang w:eastAsia="de-DE"/>
-        </w:rPr>
-        <w:t>Deployment</w:t>
-      </w:r>
-      <w:proofErr w:type="spellEnd"/>
-      <w:r>
-        <w:rPr>
-          <w:lang w:eastAsia="de-DE"/>
-        </w:rPr>
-        <w:t>-Konzept und zur Nutzung des vorhandenen Mailservers.</w:t>
-      </w:r>
-    </w:p>
-    <w:p>
-      <w:pPr>
         <w:pStyle w:val="berschrift2"/>
         <w:rPr>
           <w:rFonts w:eastAsia="Times New Roman"/>
           <w:lang w:eastAsia="de-DE"/>
         </w:rPr>
       </w:pPr>
-      <w:bookmarkStart w:id="2" w:name="_Toc243560826"/>
+      <w:bookmarkStart w:id="2" w:name="_Toc244076016"/>
       <w:r>
         <w:rPr>
           <w:rFonts w:eastAsia="Times New Roman"/>
           <w:lang w:eastAsia="de-DE"/>
         </w:rPr>
-        <w:lastRenderedPageBreak/>
-        <w:t>Zielsetzung und Zielgruppen</w:t>
+        <w:t>Ausgangssituation</w:t>
       </w:r>
       <w:bookmarkEnd w:id="2"/>
     </w:p>
     <w:p>
       <w:pPr>
-        <w:pStyle w:val="berschrift3"/>
+        <w:rPr>
+          <w:lang w:eastAsia="de-DE"/>
+        </w:rPr>
+      </w:pPr>
+      <w:r>
+        <w:rPr>
+          <w:lang w:eastAsia="de-DE"/>
+        </w:rPr>
+        <w:t>In den Gebäuden und Gruppen der Jugendhilfe der Diakonie Hochfranken gab es bisher einen physischen Kummerkasten, über den Jugendliche Anliegen, Sorgen und Rückmeldungen einreichen konnten. Auftraggeber des Projekts ist Herr Proksch als Leitung der Jugendhilfe. Die Umsetzung erfolgt durch Dana Günsche im Rahmen ihrer Ausbildung zur Fachinformatikerin für Anwendungsentwicklung. Der physische Kummerkasten sollte durch eine digitale Lösung ersetzt werden.</w:t>
+      </w:r>
+    </w:p>
+    <w:p>
+      <w:pPr>
+        <w:rPr>
+          <w:lang w:eastAsia="de-DE"/>
+        </w:rPr>
+      </w:pPr>
+      <w:r>
+        <w:rPr>
+          <w:lang w:eastAsia="de-DE"/>
+        </w:rPr>
+        <w:t>Dafür wurde zunächst ein Webformular mit E-Mail-Versand entwickelt. Der Versand lief über einen externen E-Mail-Dienstleister. Aus datenschutzrechtlicher Sicht ist das kritisch, da Nachrichteninhalte durch e</w:t>
+      </w:r>
+      <w:r>
+        <w:rPr>
+          <w:lang w:eastAsia="de-DE"/>
+        </w:rPr>
+        <w:t xml:space="preserve">inen Dritten verarbeitet werden. </w:t>
+      </w:r>
+      <w:r>
+        <w:rPr>
+          <w:lang w:eastAsia="de-DE"/>
+        </w:rPr>
+        <w:t xml:space="preserve">Zu einem produktiven Einsatz kam es nicht, weil die Abstimmung mit der IT-Abteilung zu </w:t>
+      </w:r>
+      <w:proofErr w:type="spellStart"/>
+      <w:r>
+        <w:rPr>
+          <w:lang w:eastAsia="de-DE"/>
+        </w:rPr>
+        <w:t>Deployment</w:t>
+      </w:r>
+      <w:proofErr w:type="spellEnd"/>
+      <w:r>
+        <w:rPr>
+          <w:lang w:eastAsia="de-DE"/>
+        </w:rPr>
+        <w:t xml:space="preserve"> und Betrieb nicht abgeschlossen werden konnte.</w:t>
+      </w:r>
+    </w:p>
+    <w:p>
+      <w:pPr>
+        <w:rPr>
+          <w:lang w:eastAsia="de-DE"/>
+        </w:rPr>
+      </w:pPr>
+      <w:r>
+        <w:rPr>
+          <w:lang w:eastAsia="de-DE"/>
+        </w:rPr>
+        <w:t xml:space="preserve">Nach einer Pause wurde das Projekt </w:t>
+      </w:r>
+      <w:proofErr w:type="gramStart"/>
+      <w:r>
+        <w:rPr>
+          <w:lang w:eastAsia="de-DE"/>
+        </w:rPr>
+        <w:t>wieder aufgenommen</w:t>
+      </w:r>
+      <w:proofErr w:type="gramEnd"/>
+      <w:r>
+        <w:rPr>
+          <w:lang w:eastAsia="de-DE"/>
+        </w:rPr>
+        <w:t xml:space="preserve">. In einem Gespräch mit Herrn Proksch im April 2026 wurden die Anforderungen vertieft und erweitert (u. a. Auswahl einer Ansprechperson, Zuordnung zu Haus/Gruppe, Mehrsprachigkeit, positive Rückmeldungen). Offen blieb weiterhin die Abstimmung mit der IT-Abteilung zu einem </w:t>
+      </w:r>
+      <w:proofErr w:type="spellStart"/>
+      <w:r>
+        <w:rPr>
+          <w:lang w:eastAsia="de-DE"/>
+        </w:rPr>
+        <w:t>Deployment</w:t>
+      </w:r>
+      <w:proofErr w:type="spellEnd"/>
+      <w:r>
+        <w:rPr>
+          <w:lang w:eastAsia="de-DE"/>
+        </w:rPr>
+        <w:t>-Konzept und zur Nutzung des vorhandenen Mailservers.</w:t>
+      </w:r>
+    </w:p>
+    <w:p>
+      <w:pPr>
+        <w:pStyle w:val="berschrift2"/>
         <w:rPr>
           <w:rFonts w:eastAsia="Times New Roman"/>
           <w:lang w:eastAsia="de-DE"/>
         </w:rPr>
       </w:pPr>
-      <w:bookmarkStart w:id="3" w:name="_Toc243560827"/>
+      <w:bookmarkStart w:id="3" w:name="_Toc244076017"/>
       <w:r>
         <w:rPr>
           <w:rFonts w:eastAsia="Times New Roman"/>
           <w:lang w:eastAsia="de-DE"/>
         </w:rPr>
-        <w:t>Ziel</w:t>
+        <w:lastRenderedPageBreak/>
+        <w:t>Zielsetzung und Zielgruppen</w:t>
       </w:r>
       <w:bookmarkEnd w:id="3"/>
     </w:p>
     <w:p>
       <w:pPr>
-        <w:rPr>
-          <w:lang w:eastAsia="de-DE"/>
-        </w:rPr>
-      </w:pPr>
-      <w:r>
-        <w:rPr>
-          <w:lang w:eastAsia="de-DE"/>
-        </w:rPr>
-        <w:t>Ziel des Projekts ist ein digitaler Kummerkasten, über den Kinder und Jugendliche der Jugendhilfe der Diakonie Hochfranken Anliegen, Sorgen und positive Rückmeldungen niedrigschwellig einreichen können. Die Nachricht wird per E-Mail an eine ausgewählte Ansprechperson oder an einen Gruppenverteiler zugestellt. Dabei sollen so wenige personenbezogene Daten wie möglich verarbeitet werden. Eine vollständige Anonymität wird angestrebt, kann aber nicht garantiert werden.</w:t>
-      </w:r>
+        <w:pStyle w:val="berschrift3"/>
+        <w:rPr>
+          <w:rFonts w:eastAsia="Times New Roman"/>
+          <w:lang w:eastAsia="de-DE"/>
+        </w:rPr>
+      </w:pPr>
+      <w:bookmarkStart w:id="4" w:name="_Toc244076018"/>
+      <w:r>
+        <w:rPr>
+          <w:rFonts w:eastAsia="Times New Roman"/>
+          <w:lang w:eastAsia="de-DE"/>
+        </w:rPr>
+        <w:t>Ziel</w:t>
+      </w:r>
+      <w:bookmarkEnd w:id="4"/>
     </w:p>
     <w:p>
       <w:pPr>
@@ -3757,24 +3745,37 @@
         <w:rPr>
           <w:lang w:eastAsia="de-DE"/>
         </w:rPr>
-        <w:t>In diesem Projekt wird das Konzept erarbeitet. Die Umsetzung erfolgt anschließend auf Basis der bestehenden Grundstruktur (Formular und Einreichung).</w:t>
+        <w:t>Ziel des Projekts ist ein digitaler Kummerkasten, über den Kinder und Jugendliche der Jugendhilfe der Diakonie Hochfranken Anliegen, Sorgen und positive Rückmeldungen niedrigschwellig einreichen können. Die Nachricht wird per E-Mail an eine ausgewählte Ansprechperson oder an einen Gruppenverteiler zugestellt. Dabei sollen so wenige personenbezogene Daten wie möglich verarbeitet werden. Eine vollständige Anonymität wird angestrebt, kann aber nicht garantiert werden.</w:t>
       </w:r>
     </w:p>
     <w:p>
       <w:pPr>
+        <w:rPr>
+          <w:lang w:eastAsia="de-DE"/>
+        </w:rPr>
+      </w:pPr>
+      <w:r>
+        <w:rPr>
+          <w:lang w:eastAsia="de-DE"/>
+        </w:rPr>
+        <w:t>In diesem Projekt wird das Konzept erarbeitet. Die Umsetzung erfolgt anschließend auf Basis der bestehenden Grundstruktur (Formular und Einreichung).</w:t>
+      </w:r>
+    </w:p>
+    <w:p>
+      <w:pPr>
         <w:pStyle w:val="berschrift3"/>
         <w:rPr>
           <w:lang w:eastAsia="de-DE"/>
         </w:rPr>
       </w:pPr>
-      <w:bookmarkStart w:id="4" w:name="_Toc243560828"/>
+      <w:bookmarkStart w:id="5" w:name="_Toc244076019"/>
       <w:r>
         <w:rPr>
           <w:lang w:eastAsia="de-DE"/>
         </w:rPr>
         <w:t>Zielgruppen</w:t>
       </w:r>
-      <w:bookmarkEnd w:id="4"/>
+      <w:bookmarkEnd w:id="5"/>
     </w:p>
     <w:tbl>
       <w:tblPr>
@@ -4289,14 +4290,14 @@
           <w:lang w:eastAsia="de-DE"/>
         </w:rPr>
       </w:pPr>
-      <w:bookmarkStart w:id="5" w:name="_Toc243560829"/>
+      <w:bookmarkStart w:id="6" w:name="_Toc244076020"/>
       <w:r>
         <w:rPr>
           <w:lang w:eastAsia="de-DE"/>
         </w:rPr>
         <w:t>Nicht-Monetärer Nutzen</w:t>
       </w:r>
-      <w:bookmarkEnd w:id="5"/>
+      <w:bookmarkEnd w:id="6"/>
     </w:p>
     <w:p>
       <w:pPr>
@@ -4376,7 +4377,7 @@
           <w:lang w:eastAsia="de-DE"/>
         </w:rPr>
       </w:pPr>
-      <w:bookmarkStart w:id="6" w:name="_Toc243560830"/>
+      <w:bookmarkStart w:id="7" w:name="_Toc244076021"/>
       <w:r>
         <w:rPr>
           <w:rFonts w:eastAsia="Times New Roman"/>
@@ -4384,7 +4385,7 @@
         </w:rPr>
         <w:t>Anforderungen</w:t>
       </w:r>
-      <w:bookmarkEnd w:id="6"/>
+      <w:bookmarkEnd w:id="7"/>
       <w:r>
         <w:rPr>
           <w:rFonts w:eastAsia="Times New Roman"/>
@@ -4400,14 +4401,14 @@
           <w:lang w:eastAsia="de-DE"/>
         </w:rPr>
       </w:pPr>
-      <w:bookmarkStart w:id="7" w:name="_Toc243560831"/>
+      <w:bookmarkStart w:id="8" w:name="_Toc244076022"/>
       <w:r>
         <w:rPr>
           <w:lang w:eastAsia="de-DE"/>
         </w:rPr>
         <w:t>Funktionale Anforderung</w:t>
       </w:r>
-      <w:bookmarkEnd w:id="7"/>
+      <w:bookmarkEnd w:id="8"/>
     </w:p>
     <w:tbl>
       <w:tblPr>
@@ -5492,14 +5493,14 @@
           <w:lang w:eastAsia="de-DE"/>
         </w:rPr>
       </w:pPr>
-      <w:bookmarkStart w:id="8" w:name="_Toc243560832"/>
+      <w:bookmarkStart w:id="9" w:name="_Toc244076023"/>
       <w:r>
         <w:rPr>
           <w:lang w:eastAsia="de-DE"/>
         </w:rPr>
         <w:t>Nicht Funktionale Anforderungen</w:t>
       </w:r>
-      <w:bookmarkEnd w:id="8"/>
+      <w:bookmarkEnd w:id="9"/>
     </w:p>
     <w:tbl>
       <w:tblPr>
@@ -6014,59 +6015,6 @@
           </w:p>
         </w:tc>
       </w:tr>
-      <w:tr>
-        <w:tc>
-          <w:tcPr>
-            <w:cnfStyle w:val="001000000000" w:firstRow="0" w:lastRow="0" w:firstColumn="1" w:lastColumn="0" w:oddVBand="0" w:evenVBand="0" w:oddHBand="0" w:evenHBand="0" w:firstRowFirstColumn="0" w:firstRowLastColumn="0" w:lastRowFirstColumn="0" w:lastRowLastColumn="0"/>
-            <w:tcW w:w="704" w:type="dxa"/>
-          </w:tcPr>
-          <w:p>
-            <w:pPr>
-              <w:rPr>
-                <w:lang w:eastAsia="de-DE"/>
-              </w:rPr>
-            </w:pPr>
-            <w:r>
-              <w:rPr>
-                <w:lang w:eastAsia="de-DE"/>
-              </w:rPr>
-              <w:t>N8</w:t>
-            </w:r>
-          </w:p>
-        </w:tc>
-        <w:tc>
-          <w:tcPr>
-            <w:tcW w:w="7371" w:type="dxa"/>
-          </w:tcPr>
-          <w:p>
-            <w:pPr>
-              <w:cnfStyle w:val="000000000000" w:firstRow="0" w:lastRow="0" w:firstColumn="0" w:lastColumn="0" w:oddVBand="0" w:evenVBand="0" w:oddHBand="0" w:evenHBand="0" w:firstRowFirstColumn="0" w:firstRowLastColumn="0" w:lastRowFirstColumn="0" w:lastRowLastColumn="0"/>
-              <w:rPr>
-                <w:lang w:eastAsia="de-DE"/>
-              </w:rPr>
-            </w:pPr>
-          </w:p>
-        </w:tc>
-        <w:tc>
-          <w:tcPr>
-            <w:tcW w:w="1559" w:type="dxa"/>
-          </w:tcPr>
-          <w:p>
-            <w:pPr>
-              <w:cnfStyle w:val="000000000000" w:firstRow="0" w:lastRow="0" w:firstColumn="0" w:lastColumn="0" w:oddVBand="0" w:evenVBand="0" w:oddHBand="0" w:evenHBand="0" w:firstRowFirstColumn="0" w:firstRowLastColumn="0" w:lastRowFirstColumn="0" w:lastRowLastColumn="0"/>
-              <w:rPr>
-                <w:lang w:eastAsia="de-DE"/>
-              </w:rPr>
-            </w:pPr>
-            <w:r>
-              <w:rPr>
-                <w:lang w:eastAsia="de-DE"/>
-              </w:rPr>
-              <w:t>Offen</w:t>
-            </w:r>
-          </w:p>
-        </w:tc>
-      </w:tr>
     </w:tbl>
     <w:p>
       <w:pPr>
@@ -6083,7 +6031,7 @@
           <w:lang w:eastAsia="de-DE"/>
         </w:rPr>
       </w:pPr>
-      <w:bookmarkStart w:id="9" w:name="_Toc243560833"/>
+      <w:bookmarkStart w:id="10" w:name="_Toc244076024"/>
       <w:r>
         <w:rPr>
           <w:rFonts w:eastAsia="Times New Roman"/>
@@ -6097,123 +6045,110 @@
           <w:lang w:eastAsia="de-DE"/>
         </w:rPr>
         <w:t>bgrenzung</w:t>
-      </w:r>
-      <w:bookmarkEnd w:id="9"/>
-    </w:p>
-    <w:p>
-      <w:pPr>
-        <w:rPr>
-          <w:lang w:eastAsia="de-DE"/>
-        </w:rPr>
-      </w:pPr>
-      <w:r>
-        <w:rPr>
-          <w:lang w:eastAsia="de-DE"/>
-        </w:rPr>
-        <w:t xml:space="preserve">Der digitale Kummerkasten ist ein Webformular, das Nachrichten per E-Mail an eine Ansprechperson oder an einen Gruppenverteiler zustellt. Nicht Bestandteil des Projekts sind Nutzerkonten, eine Anmeldung der Bewohner und eine Datenbank zur Speicherung von Nachrichten. Eine Rückantwort an den Absender </w:t>
-      </w:r>
-      <w:r>
-        <w:rPr>
-          <w:lang w:eastAsia="de-DE"/>
-        </w:rPr>
-        <w:t xml:space="preserve">ist </w:t>
-      </w:r>
-      <w:r>
-        <w:rPr>
-          <w:lang w:eastAsia="de-DE"/>
-        </w:rPr>
-        <w:t>nicht vorgesehen, da dies die Anonymität einschränken würde</w:t>
-      </w:r>
-      <w:r>
-        <w:rPr>
-          <w:iCs/>
-          <w:lang w:eastAsia="de-DE"/>
-        </w:rPr>
-        <w:t>.</w:t>
-      </w:r>
-      <w:r>
-        <w:rPr>
-          <w:i/>
-          <w:iCs/>
-          <w:lang w:eastAsia="de-DE"/>
-        </w:rPr>
-        <w:t xml:space="preserve"> </w:t>
-      </w:r>
-      <w:r>
-        <w:rPr>
-          <w:lang w:eastAsia="de-DE"/>
-        </w:rPr>
-        <w:t>Ebenfalls nicht enthalten ist eine Oberfläche zur Pflege von Ansprechpersonen und Häusern. Die Sprachen Französisch und Arabisch sind für spätere Releases vorgesehen.</w:t>
-      </w:r>
-    </w:p>
-    <w:p>
-      <w:pPr>
-        <w:rPr>
-          <w:lang w:eastAsia="de-DE"/>
-        </w:rPr>
-      </w:pPr>
-      <w:r>
-        <w:rPr>
-          <w:lang w:eastAsia="de-DE"/>
-        </w:rPr>
-        <w:t>Nicht in der Verantwortung des Projekts liegen die Bereitstellung der Infrastruktur (VPS, Mailserver, Einrichtung der AD-Gruppe), die rechtliche Prüfung und Freigabe des Datenschutzhinweises sowie die inhaltliche Bearbeitung der eingehenden Nachrichten. Dasselbe gilt für den Umgang mit kritischen Meldungen und die Einführung des Kummerkastens bei den Bewohnern. Diese Aufgaben liegen bei der IT-Abteilung, dem Datenschutz und der Jugendhilfe</w:t>
-      </w:r>
-      <w:r>
-        <w:rPr>
-          <w:lang w:eastAsia="de-DE"/>
-        </w:rPr>
-        <w:t xml:space="preserve">. </w:t>
-      </w:r>
-    </w:p>
-    <w:p>
-      <w:pPr>
-        <w:pStyle w:val="berschrift1"/>
-        <w:rPr>
-          <w:rFonts w:eastAsia="Times New Roman"/>
-          <w:lang w:eastAsia="de-DE"/>
-        </w:rPr>
-      </w:pPr>
-      <w:bookmarkStart w:id="10" w:name="_Toc243560834"/>
-      <w:r>
-        <w:rPr>
-          <w:rFonts w:eastAsia="Times New Roman"/>
-          <w:lang w:eastAsia="de-DE"/>
-        </w:rPr>
-        <w:lastRenderedPageBreak/>
-        <w:t>Funktionsweise und Rollen</w:t>
       </w:r>
       <w:bookmarkEnd w:id="10"/>
     </w:p>
     <w:p>
       <w:pPr>
-        <w:pStyle w:val="berschrift2"/>
+        <w:rPr>
+          <w:lang w:eastAsia="de-DE"/>
+        </w:rPr>
+      </w:pPr>
+      <w:r>
+        <w:rPr>
+          <w:lang w:eastAsia="de-DE"/>
+        </w:rPr>
+        <w:t xml:space="preserve">Der digitale Kummerkasten ist ein Webformular, das Nachrichten per E-Mail an eine Ansprechperson oder an einen Gruppenverteiler zustellt. Nicht Bestandteil des Projekts sind Nutzerkonten, eine Anmeldung der Bewohner und eine Datenbank zur Speicherung von Nachrichten. Eine Rückantwort an den Absender </w:t>
+      </w:r>
+      <w:r>
+        <w:rPr>
+          <w:lang w:eastAsia="de-DE"/>
+        </w:rPr>
+        <w:t xml:space="preserve">ist </w:t>
+      </w:r>
+      <w:r>
+        <w:rPr>
+          <w:lang w:eastAsia="de-DE"/>
+        </w:rPr>
+        <w:t>nicht vorgesehen, da dies die Anonymität einschränken würde</w:t>
+      </w:r>
+      <w:r>
+        <w:rPr>
+          <w:iCs/>
+          <w:lang w:eastAsia="de-DE"/>
+        </w:rPr>
+        <w:t>.</w:t>
+      </w:r>
+      <w:r>
+        <w:rPr>
+          <w:i/>
+          <w:iCs/>
+          <w:lang w:eastAsia="de-DE"/>
+        </w:rPr>
+        <w:t xml:space="preserve"> </w:t>
+      </w:r>
+      <w:r>
+        <w:rPr>
+          <w:lang w:eastAsia="de-DE"/>
+        </w:rPr>
+        <w:t>Ebenfalls nicht enthalten ist eine Oberfläche zur Pflege von Ansprechpersonen und Häusern. Die Sprachen Französisch und Arabisch sind für spätere Releases vorgesehen.</w:t>
+      </w:r>
+    </w:p>
+    <w:p>
+      <w:pPr>
+        <w:rPr>
+          <w:lang w:eastAsia="de-DE"/>
+        </w:rPr>
+      </w:pPr>
+      <w:r>
+        <w:rPr>
+          <w:lang w:eastAsia="de-DE"/>
+        </w:rPr>
+        <w:t>Nicht in der Verantwortung des Projekts liegen die Bereitstellung der Infrastruktur (VPS, Mailserver, Einrichtung der AD-Gruppe), die rechtliche Prüfung und Freigabe des Datenschutzhinweises sowie die inhaltliche Bearbeitung der eingehenden Nachrichten. Dasselbe gilt für den Umgang mit kritischen Meldungen und die Einführung des Kummerkastens bei den Bewohnern. Diese Aufgaben liegen bei der IT-Abteilung, dem Datenschutz und der Jugendhilfe</w:t>
+      </w:r>
+      <w:r>
+        <w:rPr>
+          <w:lang w:eastAsia="de-DE"/>
+        </w:rPr>
+        <w:t xml:space="preserve">. </w:t>
+      </w:r>
+    </w:p>
+    <w:p>
+      <w:pPr>
+        <w:pStyle w:val="berschrift1"/>
         <w:rPr>
           <w:rFonts w:eastAsia="Times New Roman"/>
           <w:lang w:eastAsia="de-DE"/>
         </w:rPr>
       </w:pPr>
-      <w:bookmarkStart w:id="11" w:name="_Toc243560835"/>
+      <w:bookmarkStart w:id="11" w:name="_Toc244076025"/>
       <w:r>
         <w:rPr>
           <w:rFonts w:eastAsia="Times New Roman"/>
           <w:lang w:eastAsia="de-DE"/>
         </w:rPr>
-        <w:t>Zugang und Token-Verfahren</w:t>
+        <w:lastRenderedPageBreak/>
+        <w:t>Funktionsweise und Rollen</w:t>
       </w:r>
       <w:bookmarkEnd w:id="11"/>
     </w:p>
     <w:p>
       <w:pPr>
-        <w:rPr>
-          <w:lang w:eastAsia="de-DE"/>
-        </w:rPr>
-      </w:pPr>
-      <w:r>
-        <w:rPr>
-          <w:lang w:eastAsia="de-DE"/>
-        </w:rPr>
-        <w:t>Der Zugang zum Kummerkasten wird über ein Token geschützt sein. Es wird keine Benutzerkonten und keine Anmeldung mit Benutzername und Passwort geben. Das Token wird ausschließlich der Zugangskontrolle dienen und nicht der Identifikation. Es wird mit einem kryptografisch sicheren Zufallsgenerator erzeugt, nicht fortlaufend sein und keine Information über den Bewohner, die Ansprechperson oder das Haus enthalten. Beim Absenden des Formulars wird das Backend prüfen, ob das Token gültig ist. Nur dann wird die Nachricht per E-Mail zugestellt.</w:t>
-      </w:r>
+        <w:pStyle w:val="berschrift2"/>
+        <w:rPr>
+          <w:rFonts w:eastAsia="Times New Roman"/>
+          <w:lang w:eastAsia="de-DE"/>
+        </w:rPr>
+      </w:pPr>
+      <w:bookmarkStart w:id="12" w:name="_Toc244076026"/>
+      <w:r>
+        <w:rPr>
+          <w:rFonts w:eastAsia="Times New Roman"/>
+          <w:lang w:eastAsia="de-DE"/>
+        </w:rPr>
+        <w:t>Zugang und Token-Verfahren</w:t>
+      </w:r>
+      <w:bookmarkEnd w:id="12"/>
     </w:p>
     <w:p>
       <w:pPr>
@@ -6225,75 +6160,51 @@
         <w:rPr>
           <w:lang w:eastAsia="de-DE"/>
         </w:rPr>
-        <w:t>Die Tokens sollen im Voraus und unabhängig von einer konkreten Nachricht ausgegeben werden und eine lange Gültigkeit haben, damit Ausgabe und Einreichung zeitlich nicht zusammenhängen. Ob dafür ein gemeinsamer Zugangscode oder ein Vorrat einzelner Tokens verwendet wird und wie die Ausgabe organisiert w</w:t>
-      </w:r>
-      <w:r>
-        <w:rPr>
-          <w:lang w:eastAsia="de-DE"/>
-        </w:rPr>
-        <w:t>ird, ist noch nicht entschieden.</w:t>
+        <w:t>Der Zugang zum Kummerkasten wird über ein Token geschützt sein. Es wird keine Benutzerkonten und keine Anmeldung mit Benutzername und Passwort geben. Das Token wird ausschließlich der Zugangskontrolle dienen und nicht der Identifikation. Es wird mit einem kryptografisch sicheren Zufallsgenerator erzeugt, nicht fortlaufend sein und keine Information über den Bewohner, die Ansprechperson oder das Haus enthalten. Beim Absenden des Formulars wird das Backend prüfen, ob das Token gültig ist. Nur dann wird die Nachricht per E-Mail zugestellt.</w:t>
       </w:r>
     </w:p>
     <w:p>
       <w:pPr>
-        <w:pStyle w:val="berschrift2"/>
-        <w:rPr>
-          <w:rFonts w:eastAsia="Times New Roman"/>
-          <w:lang w:eastAsia="de-DE"/>
-        </w:rPr>
-      </w:pPr>
-      <w:bookmarkStart w:id="12" w:name="_Toc243560836"/>
-      <w:r>
-        <w:rPr>
-          <w:rFonts w:eastAsia="Times New Roman"/>
-          <w:lang w:eastAsia="de-DE"/>
-        </w:rPr>
-        <w:t>Nachrichteneingabe</w:t>
-      </w:r>
-      <w:bookmarkEnd w:id="12"/>
-      <w:r>
-        <w:rPr>
-          <w:rFonts w:eastAsia="Times New Roman"/>
-          <w:lang w:eastAsia="de-DE"/>
-        </w:rPr>
-        <w:t xml:space="preserve"> </w:t>
+        <w:rPr>
+          <w:lang w:eastAsia="de-DE"/>
+        </w:rPr>
+      </w:pPr>
+      <w:r>
+        <w:rPr>
+          <w:lang w:eastAsia="de-DE"/>
+        </w:rPr>
+        <w:t>Die Tokens sollen im Voraus und unabhängig von einer konkreten Nachricht ausgegeben werden und eine lange Gültigkeit haben, damit Ausgabe und Einreichung zeitlich nicht zusammenhängen. Ob dafür ein gemeinsamer Zugangscode oder ein Vorrat einzelner Tokens verwendet wird und wie die Ausgabe organisiert w</w:t>
+      </w:r>
+      <w:r>
+        <w:rPr>
+          <w:lang w:eastAsia="de-DE"/>
+        </w:rPr>
+        <w:t>ird, ist noch nicht entschieden.</w:t>
       </w:r>
     </w:p>
     <w:p>
       <w:pPr>
-        <w:rPr>
-          <w:lang w:eastAsia="de-DE"/>
-        </w:rPr>
-      </w:pPr>
-      <w:r>
-        <w:rPr>
-          <w:lang w:eastAsia="de-DE"/>
-        </w:rPr>
-        <w:t>Zum Einreichen einer Nachricht wird der Bewohner das Formular aufrufen u</w:t>
-      </w:r>
-      <w:r>
-        <w:rPr>
-          <w:lang w:eastAsia="de-DE"/>
-        </w:rPr>
-        <w:t xml:space="preserve">nd sich mit dem Token ausweisen. </w:t>
-      </w:r>
-      <w:r>
-        <w:rPr>
-          <w:lang w:eastAsia="de-DE"/>
-        </w:rPr>
-        <w:t>Pflichtangabe wird die Kategorie der Nachricht sein (z. B. Regeln, Betreuer/Personal, Zimmer), außerdem wird ein Nachrichtentext benötigt. Gebäude und Gruppe werden freiwillig über je eine Auswahlliste wählbar sein. Ebenso soll eine Ansprechperson aus einer Liste ausgewählt werden können. Wird keine Ansprechperson gewählt, wird die Nachricht an den Gruppenverteiler gehen. Die Angabe des Geschlechts (weiblich, männlich, divers) wird freiwillig und als “optional” gekennzeichnet sein. Ob Gebäude, Gruppe und Geschlecht aufgenommen werden, wird noch geprüft, da sie die Gruppe</w:t>
-      </w:r>
-      <w:r>
-        <w:rPr>
-          <w:lang w:eastAsia="de-DE"/>
-        </w:rPr>
-        <w:t xml:space="preserve"> möglicher Absender verkleinern. </w:t>
-      </w:r>
-      <w:r>
-        <w:rPr>
-          <w:lang w:eastAsia="de-DE"/>
-        </w:rPr>
-        <w:t>Name, E-Mail-Adresse oder andere Kontaktdaten werden nicht abgefragt. Das Formular wird zunächst auf Deutsch und Englisch zur Verfügung stehen.</w:t>
+        <w:pStyle w:val="berschrift2"/>
+        <w:rPr>
+          <w:rFonts w:eastAsia="Times New Roman"/>
+          <w:lang w:eastAsia="de-DE"/>
+        </w:rPr>
+      </w:pPr>
+      <w:bookmarkStart w:id="13" w:name="_Toc244076027"/>
+      <w:r>
+        <w:rPr>
+          <w:rFonts w:eastAsia="Times New Roman"/>
+          <w:lang w:eastAsia="de-DE"/>
+        </w:rPr>
+        <w:t>Nachrichteneingabe</w:t>
+      </w:r>
+      <w:bookmarkEnd w:id="13"/>
+      <w:r>
+        <w:rPr>
+          <w:rFonts w:eastAsia="Times New Roman"/>
+          <w:lang w:eastAsia="de-DE"/>
+        </w:rPr>
+        <w:t xml:space="preserve"> </w:t>
       </w:r>
     </w:p>
     <w:p>
@@ -6306,26 +6217,31 @@
         <w:rPr>
           <w:lang w:eastAsia="de-DE"/>
         </w:rPr>
-        <w:t>Unterhalb der Eingabefelder wird ein Datenschutzhinweis angezeigt, den der Bewohner per Checkbox als gelesen bestätigen soll, bevor er absendet</w:t>
-      </w:r>
-      <w:r>
-        <w:rPr>
-          <w:iCs/>
-          <w:lang w:eastAsia="de-DE"/>
-        </w:rPr>
-        <w:t xml:space="preserve">. </w:t>
-      </w:r>
-      <w:r>
-        <w:rPr>
-          <w:lang w:eastAsia="de-DE"/>
-        </w:rPr>
-        <w:t>Der Text ist ein Entwurf, die Freigabe durch den Auftraggebe</w:t>
-      </w:r>
-      <w:r>
-        <w:rPr>
-          <w:lang w:eastAsia="de-DE"/>
-        </w:rPr>
-        <w:t xml:space="preserve">r und den Datenschutz steht aus. </w:t>
+        <w:t>Zum Einreichen einer Nachricht wird der Bewohner das Formular aufrufen u</w:t>
+      </w:r>
+      <w:r>
+        <w:rPr>
+          <w:lang w:eastAsia="de-DE"/>
+        </w:rPr>
+        <w:t xml:space="preserve">nd sich mit dem Token ausweisen. </w:t>
+      </w:r>
+      <w:r>
+        <w:rPr>
+          <w:lang w:eastAsia="de-DE"/>
+        </w:rPr>
+        <w:t>Pflichtangabe wird die Kategorie der Nachricht sein (z. B. Regeln, Betreuer/Personal, Zimmer), außerdem wird ein Nachrichtentext benötigt. Gebäude und Gruppe werden freiwillig über je eine Auswahlliste wählbar sein. Ebenso soll eine Ansprechperson aus einer Liste ausgewählt werden können. Wird keine Ansprechperson gewählt, wird die Nachricht an den Gruppenverteiler gehen. Die Angabe des Geschlechts (weiblich, männlich, divers) wird freiwillig und als “optional” gekennzeichnet sein. Ob Gebäude, Gruppe und Geschlecht aufgenommen werden, wird noch geprüft, da sie die Gruppe</w:t>
+      </w:r>
+      <w:r>
+        <w:rPr>
+          <w:lang w:eastAsia="de-DE"/>
+        </w:rPr>
+        <w:t xml:space="preserve"> möglicher Absender verkleinern. </w:t>
+      </w:r>
+      <w:r>
+        <w:rPr>
+          <w:lang w:eastAsia="de-DE"/>
+        </w:rPr>
+        <w:t>Name, E-Mail-Adresse oder andere Kontaktdaten werden nicht abgefragt. Das Formular wird zunächst auf Deutsch und Englisch zur Verfügung stehen.</w:t>
       </w:r>
     </w:p>
     <w:p>
@@ -6338,6 +6254,38 @@
         <w:rPr>
           <w:lang w:eastAsia="de-DE"/>
         </w:rPr>
+        <w:t>Unterhalb der Eingabefelder wird ein Datenschutzhinweis angezeigt, den der Bewohner per Checkbox als gelesen bestätigen soll, bevor er absendet</w:t>
+      </w:r>
+      <w:r>
+        <w:rPr>
+          <w:iCs/>
+          <w:lang w:eastAsia="de-DE"/>
+        </w:rPr>
+        <w:t xml:space="preserve">. </w:t>
+      </w:r>
+      <w:r>
+        <w:rPr>
+          <w:lang w:eastAsia="de-DE"/>
+        </w:rPr>
+        <w:t>Der Text ist ein Entwurf, die Freigabe durch den Auftraggebe</w:t>
+      </w:r>
+      <w:r>
+        <w:rPr>
+          <w:lang w:eastAsia="de-DE"/>
+        </w:rPr>
+        <w:t xml:space="preserve">r und den Datenschutz steht aus. </w:t>
+      </w:r>
+    </w:p>
+    <w:p>
+      <w:pPr>
+        <w:rPr>
+          <w:lang w:eastAsia="de-DE"/>
+        </w:rPr>
+      </w:pPr>
+      <w:r>
+        <w:rPr>
+          <w:lang w:eastAsia="de-DE"/>
+        </w:rPr>
         <w:t xml:space="preserve">Vor dem Absenden wird das Frontend die Eingaben prüfen, etwa ob eine Kategorie gewählt und der Nachrichtentext ausgefüllt ist und die maximale Länge nicht überschritten wird. Bei fehlenden Pflichtangaben wird ein Hinweis am betroffenen Feld erscheinen. Beim Absenden wird das Backend Token und Eingaben erneut prüfen, da die Prüfung im Browser umgangen werden kann. Die </w:t>
       </w:r>
       <w:r>
@@ -6356,7 +6304,7 @@
           <w:lang w:eastAsia="de-DE"/>
         </w:rPr>
       </w:pPr>
-      <w:bookmarkStart w:id="13" w:name="_Toc243560837"/>
+      <w:bookmarkStart w:id="14" w:name="_Toc244076028"/>
       <w:r>
         <w:rPr>
           <w:rFonts w:eastAsia="Times New Roman"/>
@@ -6364,7 +6312,7 @@
         </w:rPr>
         <w:t>Weiterleitung und Bearbeitung</w:t>
       </w:r>
-      <w:bookmarkEnd w:id="13"/>
+      <w:bookmarkEnd w:id="14"/>
     </w:p>
     <w:p>
       <w:pPr>
@@ -6450,7 +6398,7 @@
           <w:lang w:eastAsia="de-DE"/>
         </w:rPr>
       </w:pPr>
-      <w:bookmarkStart w:id="14" w:name="_Toc243560838"/>
+      <w:bookmarkStart w:id="15" w:name="_Toc244076029"/>
       <w:r>
         <w:rPr>
           <w:rFonts w:eastAsia="Times New Roman"/>
@@ -6458,7 +6406,7 @@
         </w:rPr>
         <w:t>Rollen und Berechtigungen</w:t>
       </w:r>
-      <w:bookmarkEnd w:id="14"/>
+      <w:bookmarkEnd w:id="15"/>
       <w:r>
         <w:rPr>
           <w:rFonts w:eastAsia="Times New Roman"/>
@@ -6733,7 +6681,7 @@
           <w:lang w:eastAsia="de-DE"/>
         </w:rPr>
       </w:pPr>
-      <w:bookmarkStart w:id="15" w:name="_Toc243560839"/>
+      <w:bookmarkStart w:id="16" w:name="_Toc244076030"/>
       <w:r>
         <w:rPr>
           <w:rFonts w:eastAsia="Times New Roman"/>
@@ -6741,7 +6689,7 @@
         </w:rPr>
         <w:t>Lebenszyklus einer Nachricht</w:t>
       </w:r>
-      <w:bookmarkEnd w:id="15"/>
+      <w:bookmarkEnd w:id="16"/>
       <w:r>
         <w:rPr>
           <w:rFonts w:eastAsia="Times New Roman"/>
@@ -6824,31 +6772,13 @@
           <w:lang w:eastAsia="de-DE"/>
         </w:rPr>
       </w:pPr>
-      <w:bookmarkStart w:id="16" w:name="_Toc243560840"/>
+      <w:bookmarkStart w:id="17" w:name="_Toc244076031"/>
       <w:r>
         <w:rPr>
           <w:rFonts w:eastAsia="Times New Roman"/>
           <w:lang w:eastAsia="de-DE"/>
         </w:rPr>
-        <w:t>Anonymisierung und Datenschutz</w:t>
-      </w:r>
-      <w:bookmarkEnd w:id="16"/>
-    </w:p>
-    <w:p>
-      <w:pPr>
-        <w:pStyle w:val="berschrift2"/>
-        <w:rPr>
-          <w:rFonts w:eastAsia="Times New Roman"/>
-          <w:lang w:eastAsia="de-DE"/>
-        </w:rPr>
-      </w:pPr>
-      <w:bookmarkStart w:id="17" w:name="_Toc243560841"/>
-      <w:r>
-        <w:rPr>
-          <w:rFonts w:eastAsia="Times New Roman"/>
-          <w:lang w:eastAsia="de-DE"/>
-        </w:rPr>
-        <w:t>Technologieauswahl mit Alternativen und Begründung</w:t>
+        <w:t>Technisches Konzept</w:t>
       </w:r>
       <w:bookmarkEnd w:id="17"/>
     </w:p>
@@ -6860,140 +6790,871 @@
           <w:lang w:eastAsia="de-DE"/>
         </w:rPr>
       </w:pPr>
-      <w:bookmarkStart w:id="18" w:name="_Toc243560842"/>
+      <w:bookmarkStart w:id="18" w:name="_Toc244076032"/>
       <w:r>
         <w:rPr>
           <w:rFonts w:eastAsia="Times New Roman"/>
           <w:lang w:eastAsia="de-DE"/>
         </w:rPr>
-        <w:t>Systemarchitektur</w:t>
+        <w:t>Technologieauswahl mit Alternativen und Begründung</w:t>
       </w:r>
       <w:bookmarkEnd w:id="18"/>
-      <w:r>
-        <w:rPr>
-          <w:rFonts w:eastAsia="Times New Roman"/>
-          <w:lang w:eastAsia="de-DE"/>
-        </w:rPr>
-        <w:t xml:space="preserve"> </w:t>
-      </w:r>
     </w:p>
     <w:p>
-      <w:pPr>
-        <w:rPr>
-          <w:lang w:eastAsia="de-DE"/>
-        </w:rPr>
-      </w:pPr>
-      <w:r>
-        <w:rPr>
-          <w:lang w:eastAsia="de-DE"/>
-        </w:rPr>
-        <w:t>(Diagramm mit Komponenten, Datenflüssen und Vertrauensgrenzen)</w:t>
-      </w:r>
+      <w:r>
+        <w:t>Der Kummerkasten wird möglichst schlank umgesetzt. Die Anwendung nimmt eine Nachricht entgegen, prüft sie und leitet sie per E-Mail weiter. Dafür werden weder ein Backend-Framework noch eine Datenbank oder Nutzerkonten benötigt. Die folgende Tabelle zeigt die wichtigsten Entscheidungen mit ihren Alternativen.</w:t>
+      </w:r>
+    </w:p>
+    <w:tbl>
+      <w:tblPr>
+        <w:tblStyle w:val="Gitternetztabelle4Akzent2"/>
+        <w:tblW w:w="0" w:type="auto"/>
+        <w:tblLook w:val="04A0" w:firstRow="1" w:lastRow="0" w:firstColumn="1" w:lastColumn="0" w:noHBand="0" w:noVBand="1"/>
+      </w:tblPr>
+      <w:tblGrid>
+        <w:gridCol w:w="1970"/>
+        <w:gridCol w:w="2070"/>
+        <w:gridCol w:w="2286"/>
+        <w:gridCol w:w="3301"/>
+      </w:tblGrid>
+      <w:tr>
+        <w:trPr>
+          <w:cnfStyle w:val="100000000000" w:firstRow="1" w:lastRow="0" w:firstColumn="0" w:lastColumn="0" w:oddVBand="0" w:evenVBand="0" w:oddHBand="0" w:evenHBand="0" w:firstRowFirstColumn="0" w:firstRowLastColumn="0" w:lastRowFirstColumn="0" w:lastRowLastColumn="0"/>
+          <w:tblHeader/>
+        </w:trPr>
+        <w:tc>
+          <w:tcPr>
+            <w:cnfStyle w:val="001000000000" w:firstRow="0" w:lastRow="0" w:firstColumn="1" w:lastColumn="0" w:oddVBand="0" w:evenVBand="0" w:oddHBand="0" w:evenHBand="0" w:firstRowFirstColumn="0" w:firstRowLastColumn="0" w:lastRowFirstColumn="0" w:lastRowLastColumn="0"/>
+            <w:tcW w:w="1271" w:type="dxa"/>
+          </w:tcPr>
+          <w:p>
+            <w:pPr>
+              <w:rPr>
+                <w:lang w:eastAsia="de-DE"/>
+              </w:rPr>
+            </w:pPr>
+            <w:r>
+              <w:rPr>
+                <w:lang w:eastAsia="de-DE"/>
+              </w:rPr>
+              <w:t>Bereich</w:t>
+            </w:r>
+          </w:p>
+        </w:tc>
+        <w:tc>
+          <w:tcPr>
+            <w:tcW w:w="2268" w:type="dxa"/>
+          </w:tcPr>
+          <w:p>
+            <w:pPr>
+              <w:cnfStyle w:val="100000000000" w:firstRow="1" w:lastRow="0" w:firstColumn="0" w:lastColumn="0" w:oddVBand="0" w:evenVBand="0" w:oddHBand="0" w:evenHBand="0" w:firstRowFirstColumn="0" w:firstRowLastColumn="0" w:lastRowFirstColumn="0" w:lastRowLastColumn="0"/>
+              <w:rPr>
+                <w:lang w:eastAsia="de-DE"/>
+              </w:rPr>
+            </w:pPr>
+            <w:r>
+              <w:rPr>
+                <w:lang w:eastAsia="de-DE"/>
+              </w:rPr>
+              <w:t>Alternative</w:t>
+            </w:r>
+          </w:p>
+        </w:tc>
+        <w:tc>
+          <w:tcPr>
+            <w:tcW w:w="2126" w:type="dxa"/>
+          </w:tcPr>
+          <w:p>
+            <w:pPr>
+              <w:cnfStyle w:val="100000000000" w:firstRow="1" w:lastRow="0" w:firstColumn="0" w:lastColumn="0" w:oddVBand="0" w:evenVBand="0" w:oddHBand="0" w:evenHBand="0" w:firstRowFirstColumn="0" w:firstRowLastColumn="0" w:lastRowFirstColumn="0" w:lastRowLastColumn="0"/>
+              <w:rPr>
+                <w:lang w:eastAsia="de-DE"/>
+              </w:rPr>
+            </w:pPr>
+            <w:r>
+              <w:rPr>
+                <w:lang w:eastAsia="de-DE"/>
+              </w:rPr>
+              <w:t>Entscheidung</w:t>
+            </w:r>
+          </w:p>
+        </w:tc>
+        <w:tc>
+          <w:tcPr>
+            <w:tcW w:w="3962" w:type="dxa"/>
+          </w:tcPr>
+          <w:p>
+            <w:pPr>
+              <w:cnfStyle w:val="100000000000" w:firstRow="1" w:lastRow="0" w:firstColumn="0" w:lastColumn="0" w:oddVBand="0" w:evenVBand="0" w:oddHBand="0" w:evenHBand="0" w:firstRowFirstColumn="0" w:firstRowLastColumn="0" w:lastRowFirstColumn="0" w:lastRowLastColumn="0"/>
+              <w:rPr>
+                <w:lang w:eastAsia="de-DE"/>
+              </w:rPr>
+            </w:pPr>
+            <w:r>
+              <w:rPr>
+                <w:lang w:eastAsia="de-DE"/>
+              </w:rPr>
+              <w:t>Begründung</w:t>
+            </w:r>
+          </w:p>
+        </w:tc>
+      </w:tr>
+      <w:tr>
+        <w:trPr>
+          <w:cnfStyle w:val="000000100000" w:firstRow="0" w:lastRow="0" w:firstColumn="0" w:lastColumn="0" w:oddVBand="0" w:evenVBand="0" w:oddHBand="1" w:evenHBand="0" w:firstRowFirstColumn="0" w:firstRowLastColumn="0" w:lastRowFirstColumn="0" w:lastRowLastColumn="0"/>
+        </w:trPr>
+        <w:tc>
+          <w:tcPr>
+            <w:cnfStyle w:val="001000000000" w:firstRow="0" w:lastRow="0" w:firstColumn="1" w:lastColumn="0" w:oddVBand="0" w:evenVBand="0" w:oddHBand="0" w:evenHBand="0" w:firstRowFirstColumn="0" w:firstRowLastColumn="0" w:lastRowFirstColumn="0" w:lastRowLastColumn="0"/>
+            <w:tcW w:w="1271" w:type="dxa"/>
+          </w:tcPr>
+          <w:p>
+            <w:pPr>
+              <w:rPr>
+                <w:lang w:eastAsia="de-DE"/>
+              </w:rPr>
+            </w:pPr>
+            <w:r>
+              <w:rPr>
+                <w:lang w:eastAsia="de-DE"/>
+              </w:rPr>
+              <w:t>Frontend</w:t>
+            </w:r>
+          </w:p>
+        </w:tc>
+        <w:tc>
+          <w:tcPr>
+            <w:tcW w:w="2268" w:type="dxa"/>
+          </w:tcPr>
+          <w:p>
+            <w:pPr>
+              <w:cnfStyle w:val="000000100000" w:firstRow="0" w:lastRow="0" w:firstColumn="0" w:lastColumn="0" w:oddVBand="0" w:evenVBand="0" w:oddHBand="1" w:evenHBand="0" w:firstRowFirstColumn="0" w:firstRowLastColumn="0" w:lastRowFirstColumn="0" w:lastRowLastColumn="0"/>
+              <w:rPr>
+                <w:lang w:eastAsia="de-DE"/>
+              </w:rPr>
+            </w:pPr>
+            <w:r>
+              <w:rPr>
+                <w:lang w:eastAsia="de-DE"/>
+              </w:rPr>
+              <w:t xml:space="preserve">Klassische Seiten mit HTML und </w:t>
+            </w:r>
+            <w:proofErr w:type="spellStart"/>
+            <w:r>
+              <w:rPr>
+                <w:lang w:eastAsia="de-DE"/>
+              </w:rPr>
+              <w:t>Javascript</w:t>
+            </w:r>
+            <w:proofErr w:type="spellEnd"/>
+          </w:p>
+        </w:tc>
+        <w:tc>
+          <w:tcPr>
+            <w:tcW w:w="2126" w:type="dxa"/>
+          </w:tcPr>
+          <w:p>
+            <w:pPr>
+              <w:cnfStyle w:val="000000100000" w:firstRow="0" w:lastRow="0" w:firstColumn="0" w:lastColumn="0" w:oddVBand="0" w:evenVBand="0" w:oddHBand="1" w:evenHBand="0" w:firstRowFirstColumn="0" w:firstRowLastColumn="0" w:lastRowFirstColumn="0" w:lastRowLastColumn="0"/>
+              <w:rPr>
+                <w:lang w:eastAsia="de-DE"/>
+              </w:rPr>
+            </w:pPr>
+            <w:proofErr w:type="spellStart"/>
+            <w:r>
+              <w:rPr>
+                <w:lang w:eastAsia="de-DE"/>
+              </w:rPr>
+              <w:t>Vue</w:t>
+            </w:r>
+            <w:proofErr w:type="spellEnd"/>
+            <w:r>
+              <w:rPr>
+                <w:lang w:eastAsia="de-DE"/>
+              </w:rPr>
+              <w:t xml:space="preserve"> mit </w:t>
+            </w:r>
+            <w:proofErr w:type="spellStart"/>
+            <w:r>
+              <w:rPr>
+                <w:lang w:eastAsia="de-DE"/>
+              </w:rPr>
+              <w:t>Vuetify</w:t>
+            </w:r>
+            <w:proofErr w:type="spellEnd"/>
+          </w:p>
+        </w:tc>
+        <w:tc>
+          <w:tcPr>
+            <w:tcW w:w="3962" w:type="dxa"/>
+          </w:tcPr>
+          <w:p>
+            <w:pPr>
+              <w:cnfStyle w:val="000000100000" w:firstRow="0" w:lastRow="0" w:firstColumn="0" w:lastColumn="0" w:oddVBand="0" w:evenVBand="0" w:oddHBand="1" w:evenHBand="0" w:firstRowFirstColumn="0" w:firstRowLastColumn="0" w:lastRowFirstColumn="0" w:lastRowLastColumn="0"/>
+              <w:rPr>
+                <w:lang w:eastAsia="de-DE"/>
+              </w:rPr>
+            </w:pPr>
+            <w:r>
+              <w:rPr>
+                <w:lang w:eastAsia="de-DE"/>
+              </w:rPr>
+              <w:t>Fertige, mobilfreundliche Komponenten, dadurch deutlich geringerer Entwicklungsaufwand</w:t>
+            </w:r>
+          </w:p>
+        </w:tc>
+      </w:tr>
+      <w:tr>
+        <w:tc>
+          <w:tcPr>
+            <w:cnfStyle w:val="001000000000" w:firstRow="0" w:lastRow="0" w:firstColumn="1" w:lastColumn="0" w:oddVBand="0" w:evenVBand="0" w:oddHBand="0" w:evenHBand="0" w:firstRowFirstColumn="0" w:firstRowLastColumn="0" w:lastRowFirstColumn="0" w:lastRowLastColumn="0"/>
+            <w:tcW w:w="1271" w:type="dxa"/>
+          </w:tcPr>
+          <w:p>
+            <w:pPr>
+              <w:tabs>
+                <w:tab w:val="left" w:pos="591"/>
+              </w:tabs>
+              <w:rPr>
+                <w:lang w:eastAsia="de-DE"/>
+              </w:rPr>
+            </w:pPr>
+            <w:r>
+              <w:rPr>
+                <w:lang w:eastAsia="de-DE"/>
+              </w:rPr>
+              <w:t>Serverlogik</w:t>
+            </w:r>
+          </w:p>
+        </w:tc>
+        <w:tc>
+          <w:tcPr>
+            <w:tcW w:w="2268" w:type="dxa"/>
+          </w:tcPr>
+          <w:p>
+            <w:pPr>
+              <w:cnfStyle w:val="000000000000" w:firstRow="0" w:lastRow="0" w:firstColumn="0" w:lastColumn="0" w:oddVBand="0" w:evenVBand="0" w:oddHBand="0" w:evenHBand="0" w:firstRowFirstColumn="0" w:firstRowLastColumn="0" w:lastRowFirstColumn="0" w:lastRowLastColumn="0"/>
+              <w:rPr>
+                <w:lang w:eastAsia="de-DE"/>
+              </w:rPr>
+            </w:pPr>
+            <w:proofErr w:type="spellStart"/>
+            <w:r>
+              <w:rPr>
+                <w:lang w:eastAsia="de-DE"/>
+              </w:rPr>
+              <w:t>Laravel</w:t>
+            </w:r>
+            <w:proofErr w:type="spellEnd"/>
+            <w:r>
+              <w:rPr>
+                <w:lang w:eastAsia="de-DE"/>
+              </w:rPr>
+              <w:t xml:space="preserve"> Backend mit Datenbank</w:t>
+            </w:r>
+          </w:p>
+        </w:tc>
+        <w:tc>
+          <w:tcPr>
+            <w:tcW w:w="2126" w:type="dxa"/>
+          </w:tcPr>
+          <w:p>
+            <w:pPr>
+              <w:cnfStyle w:val="000000000000" w:firstRow="0" w:lastRow="0" w:firstColumn="0" w:lastColumn="0" w:oddVBand="0" w:evenVBand="0" w:oddHBand="0" w:evenHBand="0" w:firstRowFirstColumn="0" w:firstRowLastColumn="0" w:lastRowFirstColumn="0" w:lastRowLastColumn="0"/>
+              <w:rPr>
+                <w:lang w:eastAsia="de-DE"/>
+              </w:rPr>
+            </w:pPr>
+            <w:r>
+              <w:rPr>
+                <w:lang w:eastAsia="de-DE"/>
+              </w:rPr>
+              <w:t>Kleiner PHP-Endpunkt</w:t>
+            </w:r>
+          </w:p>
+        </w:tc>
+        <w:tc>
+          <w:tcPr>
+            <w:tcW w:w="3962" w:type="dxa"/>
+          </w:tcPr>
+          <w:p>
+            <w:pPr>
+              <w:cnfStyle w:val="000000000000" w:firstRow="0" w:lastRow="0" w:firstColumn="0" w:lastColumn="0" w:oddVBand="0" w:evenVBand="0" w:oddHBand="0" w:evenHBand="0" w:firstRowFirstColumn="0" w:firstRowLastColumn="0" w:lastRowFirstColumn="0" w:lastRowLastColumn="0"/>
+              <w:rPr>
+                <w:lang w:eastAsia="de-DE"/>
+              </w:rPr>
+            </w:pPr>
+            <w:r>
+              <w:rPr>
+                <w:lang w:eastAsia="de-DE"/>
+              </w:rPr>
+              <w:t>Es muss nur geprüft und weitergeleitet werden, ein Framework wäre hierfür überdimensioniert</w:t>
+            </w:r>
+          </w:p>
+        </w:tc>
+      </w:tr>
+      <w:tr>
+        <w:trPr>
+          <w:cnfStyle w:val="000000100000" w:firstRow="0" w:lastRow="0" w:firstColumn="0" w:lastColumn="0" w:oddVBand="0" w:evenVBand="0" w:oddHBand="1" w:evenHBand="0" w:firstRowFirstColumn="0" w:firstRowLastColumn="0" w:lastRowFirstColumn="0" w:lastRowLastColumn="0"/>
+        </w:trPr>
+        <w:tc>
+          <w:tcPr>
+            <w:cnfStyle w:val="001000000000" w:firstRow="0" w:lastRow="0" w:firstColumn="1" w:lastColumn="0" w:oddVBand="0" w:evenVBand="0" w:oddHBand="0" w:evenHBand="0" w:firstRowFirstColumn="0" w:firstRowLastColumn="0" w:lastRowFirstColumn="0" w:lastRowLastColumn="0"/>
+            <w:tcW w:w="1271" w:type="dxa"/>
+          </w:tcPr>
+          <w:p>
+            <w:pPr>
+              <w:rPr>
+                <w:lang w:eastAsia="de-DE"/>
+              </w:rPr>
+            </w:pPr>
+            <w:r>
+              <w:rPr>
+                <w:lang w:eastAsia="de-DE"/>
+              </w:rPr>
+              <w:t>Datenhaltung</w:t>
+            </w:r>
+          </w:p>
+        </w:tc>
+        <w:tc>
+          <w:tcPr>
+            <w:tcW w:w="2268" w:type="dxa"/>
+          </w:tcPr>
+          <w:p>
+            <w:pPr>
+              <w:cnfStyle w:val="000000100000" w:firstRow="0" w:lastRow="0" w:firstColumn="0" w:lastColumn="0" w:oddVBand="0" w:evenVBand="0" w:oddHBand="1" w:evenHBand="0" w:firstRowFirstColumn="0" w:firstRowLastColumn="0" w:lastRowFirstColumn="0" w:lastRowLastColumn="0"/>
+              <w:rPr>
+                <w:lang w:eastAsia="de-DE"/>
+              </w:rPr>
+            </w:pPr>
+            <w:r>
+              <w:rPr>
+                <w:lang w:eastAsia="de-DE"/>
+              </w:rPr>
+              <w:t>Speicherung in Datenbank oder Datei</w:t>
+            </w:r>
+          </w:p>
+        </w:tc>
+        <w:tc>
+          <w:tcPr>
+            <w:tcW w:w="2126" w:type="dxa"/>
+          </w:tcPr>
+          <w:p>
+            <w:pPr>
+              <w:cnfStyle w:val="000000100000" w:firstRow="0" w:lastRow="0" w:firstColumn="0" w:lastColumn="0" w:oddVBand="0" w:evenVBand="0" w:oddHBand="1" w:evenHBand="0" w:firstRowFirstColumn="0" w:firstRowLastColumn="0" w:lastRowFirstColumn="0" w:lastRowLastColumn="0"/>
+              <w:rPr>
+                <w:lang w:eastAsia="de-DE"/>
+              </w:rPr>
+            </w:pPr>
+            <w:r>
+              <w:rPr>
+                <w:lang w:eastAsia="de-DE"/>
+              </w:rPr>
+              <w:t>Keine Speicherung</w:t>
+            </w:r>
+          </w:p>
+        </w:tc>
+        <w:tc>
+          <w:tcPr>
+            <w:tcW w:w="3962" w:type="dxa"/>
+          </w:tcPr>
+          <w:p>
+            <w:pPr>
+              <w:cnfStyle w:val="000000100000" w:firstRow="0" w:lastRow="0" w:firstColumn="0" w:lastColumn="0" w:oddVBand="0" w:evenVBand="0" w:oddHBand="1" w:evenHBand="0" w:firstRowFirstColumn="0" w:firstRowLastColumn="0" w:lastRowFirstColumn="0" w:lastRowLastColumn="0"/>
+              <w:rPr>
+                <w:lang w:eastAsia="de-DE"/>
+              </w:rPr>
+            </w:pPr>
+            <w:r>
+              <w:rPr>
+                <w:lang w:eastAsia="de-DE"/>
+              </w:rPr>
+              <w:t>Gewährleistung von Anonymität, einfacherer Datenschutz, weniger Entwicklungsaufwand</w:t>
+            </w:r>
+          </w:p>
+        </w:tc>
+      </w:tr>
+      <w:tr>
+        <w:tc>
+          <w:tcPr>
+            <w:cnfStyle w:val="001000000000" w:firstRow="0" w:lastRow="0" w:firstColumn="1" w:lastColumn="0" w:oddVBand="0" w:evenVBand="0" w:oddHBand="0" w:evenHBand="0" w:firstRowFirstColumn="0" w:firstRowLastColumn="0" w:lastRowFirstColumn="0" w:lastRowLastColumn="0"/>
+            <w:tcW w:w="1271" w:type="dxa"/>
+          </w:tcPr>
+          <w:p>
+            <w:pPr>
+              <w:rPr>
+                <w:lang w:eastAsia="de-DE"/>
+              </w:rPr>
+            </w:pPr>
+            <w:r>
+              <w:rPr>
+                <w:lang w:eastAsia="de-DE"/>
+              </w:rPr>
+              <w:t>Mailversand</w:t>
+            </w:r>
+          </w:p>
+        </w:tc>
+        <w:tc>
+          <w:tcPr>
+            <w:tcW w:w="2268" w:type="dxa"/>
+          </w:tcPr>
+          <w:p>
+            <w:pPr>
+              <w:cnfStyle w:val="000000000000" w:firstRow="0" w:lastRow="0" w:firstColumn="0" w:lastColumn="0" w:oddVBand="0" w:evenVBand="0" w:oddHBand="0" w:evenHBand="0" w:firstRowFirstColumn="0" w:firstRowLastColumn="0" w:lastRowFirstColumn="0" w:lastRowLastColumn="0"/>
+              <w:rPr>
+                <w:lang w:eastAsia="de-DE"/>
+              </w:rPr>
+            </w:pPr>
+            <w:r>
+              <w:rPr>
+                <w:lang w:eastAsia="de-DE"/>
+              </w:rPr>
+              <w:t>Externer E-Mail Dienstleister</w:t>
+            </w:r>
+          </w:p>
+        </w:tc>
+        <w:tc>
+          <w:tcPr>
+            <w:tcW w:w="2126" w:type="dxa"/>
+          </w:tcPr>
+          <w:p>
+            <w:pPr>
+              <w:cnfStyle w:val="000000000000" w:firstRow="0" w:lastRow="0" w:firstColumn="0" w:lastColumn="0" w:oddVBand="0" w:evenVBand="0" w:oddHBand="0" w:evenHBand="0" w:firstRowFirstColumn="0" w:firstRowLastColumn="0" w:lastRowFirstColumn="0" w:lastRowLastColumn="0"/>
+              <w:rPr>
+                <w:lang w:eastAsia="de-DE"/>
+              </w:rPr>
+            </w:pPr>
+            <w:r>
+              <w:rPr>
+                <w:lang w:eastAsia="de-DE"/>
+              </w:rPr>
+              <w:t>Interner Mailserver</w:t>
+            </w:r>
+          </w:p>
+        </w:tc>
+        <w:tc>
+          <w:tcPr>
+            <w:tcW w:w="3962" w:type="dxa"/>
+          </w:tcPr>
+          <w:p>
+            <w:pPr>
+              <w:cnfStyle w:val="000000000000" w:firstRow="0" w:lastRow="0" w:firstColumn="0" w:lastColumn="0" w:oddVBand="0" w:evenVBand="0" w:oddHBand="0" w:evenHBand="0" w:firstRowFirstColumn="0" w:firstRowLastColumn="0" w:lastRowFirstColumn="0" w:lastRowLastColumn="0"/>
+              <w:rPr>
+                <w:lang w:eastAsia="de-DE"/>
+              </w:rPr>
+            </w:pPr>
+            <w:r>
+              <w:rPr>
+                <w:lang w:eastAsia="de-DE"/>
+              </w:rPr>
+              <w:t>Nachrichteninhalte werden nicht durch Dritte verarbeitet (N3)</w:t>
+            </w:r>
+          </w:p>
+        </w:tc>
+      </w:tr>
+      <w:tr>
+        <w:trPr>
+          <w:cnfStyle w:val="000000100000" w:firstRow="0" w:lastRow="0" w:firstColumn="0" w:lastColumn="0" w:oddVBand="0" w:evenVBand="0" w:oddHBand="1" w:evenHBand="0" w:firstRowFirstColumn="0" w:firstRowLastColumn="0" w:lastRowFirstColumn="0" w:lastRowLastColumn="0"/>
+        </w:trPr>
+        <w:tc>
+          <w:tcPr>
+            <w:cnfStyle w:val="001000000000" w:firstRow="0" w:lastRow="0" w:firstColumn="1" w:lastColumn="0" w:oddVBand="0" w:evenVBand="0" w:oddHBand="0" w:evenHBand="0" w:firstRowFirstColumn="0" w:firstRowLastColumn="0" w:lastRowFirstColumn="0" w:lastRowLastColumn="0"/>
+            <w:tcW w:w="1271" w:type="dxa"/>
+          </w:tcPr>
+          <w:p>
+            <w:pPr>
+              <w:rPr>
+                <w:lang w:eastAsia="de-DE"/>
+              </w:rPr>
+            </w:pPr>
+            <w:r>
+              <w:rPr>
+                <w:lang w:eastAsia="de-DE"/>
+              </w:rPr>
+              <w:lastRenderedPageBreak/>
+              <w:t>Mailbibliothek</w:t>
+            </w:r>
+          </w:p>
+        </w:tc>
+        <w:tc>
+          <w:tcPr>
+            <w:tcW w:w="2268" w:type="dxa"/>
+          </w:tcPr>
+          <w:p>
+            <w:pPr>
+              <w:cnfStyle w:val="000000100000" w:firstRow="0" w:lastRow="0" w:firstColumn="0" w:lastColumn="0" w:oddVBand="0" w:evenVBand="0" w:oddHBand="1" w:evenHBand="0" w:firstRowFirstColumn="0" w:firstRowLastColumn="0" w:lastRowFirstColumn="0" w:lastRowLastColumn="0"/>
+              <w:rPr>
+                <w:lang w:eastAsia="de-DE"/>
+              </w:rPr>
+            </w:pPr>
+            <w:r>
+              <w:rPr>
+                <w:lang w:eastAsia="de-DE"/>
+              </w:rPr>
+              <w:t>PHP mail()</w:t>
+            </w:r>
+          </w:p>
+        </w:tc>
+        <w:tc>
+          <w:tcPr>
+            <w:tcW w:w="2126" w:type="dxa"/>
+          </w:tcPr>
+          <w:p>
+            <w:pPr>
+              <w:cnfStyle w:val="000000100000" w:firstRow="0" w:lastRow="0" w:firstColumn="0" w:lastColumn="0" w:oddVBand="0" w:evenVBand="0" w:oddHBand="1" w:evenHBand="0" w:firstRowFirstColumn="0" w:firstRowLastColumn="0" w:lastRowFirstColumn="0" w:lastRowLastColumn="0"/>
+              <w:rPr>
+                <w:lang w:eastAsia="de-DE"/>
+              </w:rPr>
+            </w:pPr>
+            <w:proofErr w:type="spellStart"/>
+            <w:r>
+              <w:rPr>
+                <w:lang w:eastAsia="de-DE"/>
+              </w:rPr>
+              <w:t>PHPMailer</w:t>
+            </w:r>
+            <w:proofErr w:type="spellEnd"/>
+          </w:p>
+        </w:tc>
+        <w:tc>
+          <w:tcPr>
+            <w:tcW w:w="3962" w:type="dxa"/>
+          </w:tcPr>
+          <w:p>
+            <w:pPr>
+              <w:cnfStyle w:val="000000100000" w:firstRow="0" w:lastRow="0" w:firstColumn="0" w:lastColumn="0" w:oddVBand="0" w:evenVBand="0" w:oddHBand="1" w:evenHBand="0" w:firstRowFirstColumn="0" w:firstRowLastColumn="0" w:lastRowFirstColumn="0" w:lastRowLastColumn="0"/>
+              <w:rPr>
+                <w:lang w:eastAsia="de-DE"/>
+              </w:rPr>
+            </w:pPr>
+            <w:r>
+              <w:rPr>
+                <w:lang w:eastAsia="de-DE"/>
+              </w:rPr>
+              <w:t>SMTP, TLS und bessere, formalisierte Fehlerbehandlung</w:t>
+            </w:r>
+          </w:p>
+        </w:tc>
+      </w:tr>
+      <w:tr>
+        <w:tc>
+          <w:tcPr>
+            <w:cnfStyle w:val="001000000000" w:firstRow="0" w:lastRow="0" w:firstColumn="1" w:lastColumn="0" w:oddVBand="0" w:evenVBand="0" w:oddHBand="0" w:evenHBand="0" w:firstRowFirstColumn="0" w:firstRowLastColumn="0" w:lastRowFirstColumn="0" w:lastRowLastColumn="0"/>
+            <w:tcW w:w="1271" w:type="dxa"/>
+          </w:tcPr>
+          <w:p>
+            <w:pPr>
+              <w:rPr>
+                <w:lang w:eastAsia="de-DE"/>
+              </w:rPr>
+            </w:pPr>
+            <w:r>
+              <w:rPr>
+                <w:lang w:eastAsia="de-DE"/>
+              </w:rPr>
+              <w:t>Zugangskontrolle</w:t>
+            </w:r>
+          </w:p>
+        </w:tc>
+        <w:tc>
+          <w:tcPr>
+            <w:tcW w:w="2268" w:type="dxa"/>
+          </w:tcPr>
+          <w:p>
+            <w:pPr>
+              <w:cnfStyle w:val="000000000000" w:firstRow="0" w:lastRow="0" w:firstColumn="0" w:lastColumn="0" w:oddVBand="0" w:evenVBand="0" w:oddHBand="0" w:evenHBand="0" w:firstRowFirstColumn="0" w:firstRowLastColumn="0" w:lastRowFirstColumn="0" w:lastRowLastColumn="0"/>
+              <w:rPr>
+                <w:lang w:eastAsia="de-DE"/>
+              </w:rPr>
+            </w:pPr>
+            <w:r>
+              <w:rPr>
+                <w:lang w:eastAsia="de-DE"/>
+              </w:rPr>
+              <w:t>Benutzerkonten mit Login</w:t>
+            </w:r>
+          </w:p>
+        </w:tc>
+        <w:tc>
+          <w:tcPr>
+            <w:tcW w:w="2126" w:type="dxa"/>
+          </w:tcPr>
+          <w:p>
+            <w:pPr>
+              <w:cnfStyle w:val="000000000000" w:firstRow="0" w:lastRow="0" w:firstColumn="0" w:lastColumn="0" w:oddVBand="0" w:evenVBand="0" w:oddHBand="0" w:evenHBand="0" w:firstRowFirstColumn="0" w:firstRowLastColumn="0" w:lastRowFirstColumn="0" w:lastRowLastColumn="0"/>
+              <w:rPr>
+                <w:lang w:eastAsia="de-DE"/>
+              </w:rPr>
+            </w:pPr>
+            <w:r>
+              <w:rPr>
+                <w:lang w:eastAsia="de-DE"/>
+              </w:rPr>
+              <w:t>Token</w:t>
+            </w:r>
+          </w:p>
+        </w:tc>
+        <w:tc>
+          <w:tcPr>
+            <w:tcW w:w="3962" w:type="dxa"/>
+          </w:tcPr>
+          <w:p>
+            <w:pPr>
+              <w:cnfStyle w:val="000000000000" w:firstRow="0" w:lastRow="0" w:firstColumn="0" w:lastColumn="0" w:oddVBand="0" w:evenVBand="0" w:oddHBand="0" w:evenHBand="0" w:firstRowFirstColumn="0" w:firstRowLastColumn="0" w:lastRowFirstColumn="0" w:lastRowLastColumn="0"/>
+              <w:rPr>
+                <w:lang w:eastAsia="de-DE"/>
+              </w:rPr>
+            </w:pPr>
+            <w:r>
+              <w:rPr>
+                <w:lang w:eastAsia="de-DE"/>
+              </w:rPr>
+              <w:t>Gewährleistung von Anonymität</w:t>
+            </w:r>
+          </w:p>
+        </w:tc>
+      </w:tr>
+      <w:tr>
+        <w:trPr>
+          <w:cnfStyle w:val="000000100000" w:firstRow="0" w:lastRow="0" w:firstColumn="0" w:lastColumn="0" w:oddVBand="0" w:evenVBand="0" w:oddHBand="1" w:evenHBand="0" w:firstRowFirstColumn="0" w:firstRowLastColumn="0" w:lastRowFirstColumn="0" w:lastRowLastColumn="0"/>
+        </w:trPr>
+        <w:tc>
+          <w:tcPr>
+            <w:cnfStyle w:val="001000000000" w:firstRow="0" w:lastRow="0" w:firstColumn="1" w:lastColumn="0" w:oddVBand="0" w:evenVBand="0" w:oddHBand="0" w:evenHBand="0" w:firstRowFirstColumn="0" w:firstRowLastColumn="0" w:lastRowFirstColumn="0" w:lastRowLastColumn="0"/>
+            <w:tcW w:w="1271" w:type="dxa"/>
+          </w:tcPr>
+          <w:p>
+            <w:pPr>
+              <w:rPr>
+                <w:lang w:eastAsia="de-DE"/>
+              </w:rPr>
+            </w:pPr>
+            <w:r>
+              <w:rPr>
+                <w:lang w:eastAsia="de-DE"/>
+              </w:rPr>
+              <w:t>Mehrsprachigkeit</w:t>
+            </w:r>
+          </w:p>
+        </w:tc>
+        <w:tc>
+          <w:tcPr>
+            <w:tcW w:w="2268" w:type="dxa"/>
+          </w:tcPr>
+          <w:p>
+            <w:pPr>
+              <w:cnfStyle w:val="000000100000" w:firstRow="0" w:lastRow="0" w:firstColumn="0" w:lastColumn="0" w:oddVBand="0" w:evenVBand="0" w:oddHBand="1" w:evenHBand="0" w:firstRowFirstColumn="0" w:firstRowLastColumn="0" w:lastRowFirstColumn="0" w:lastRowLastColumn="0"/>
+              <w:rPr>
+                <w:lang w:eastAsia="de-DE"/>
+              </w:rPr>
+            </w:pPr>
+            <w:r>
+              <w:rPr>
+                <w:lang w:eastAsia="de-DE"/>
+              </w:rPr>
+              <w:t>Eine Seite pro Sprache</w:t>
+            </w:r>
+          </w:p>
+        </w:tc>
+        <w:tc>
+          <w:tcPr>
+            <w:tcW w:w="2126" w:type="dxa"/>
+          </w:tcPr>
+          <w:p>
+            <w:pPr>
+              <w:cnfStyle w:val="000000100000" w:firstRow="0" w:lastRow="0" w:firstColumn="0" w:lastColumn="0" w:oddVBand="0" w:evenVBand="0" w:oddHBand="1" w:evenHBand="0" w:firstRowFirstColumn="0" w:firstRowLastColumn="0" w:lastRowFirstColumn="0" w:lastRowLastColumn="0"/>
+              <w:rPr>
+                <w:lang w:eastAsia="de-DE"/>
+              </w:rPr>
+            </w:pPr>
+            <w:r>
+              <w:rPr>
+                <w:lang w:eastAsia="de-DE"/>
+              </w:rPr>
+              <w:t>Übersetzungsobjekte</w:t>
+            </w:r>
+          </w:p>
+        </w:tc>
+        <w:tc>
+          <w:tcPr>
+            <w:tcW w:w="3962" w:type="dxa"/>
+          </w:tcPr>
+          <w:p>
+            <w:pPr>
+              <w:cnfStyle w:val="000000100000" w:firstRow="0" w:lastRow="0" w:firstColumn="0" w:lastColumn="0" w:oddVBand="0" w:evenVBand="0" w:oddHBand="1" w:evenHBand="0" w:firstRowFirstColumn="0" w:firstRowLastColumn="0" w:lastRowFirstColumn="0" w:lastRowLastColumn="0"/>
+              <w:rPr>
+                <w:lang w:eastAsia="de-DE"/>
+              </w:rPr>
+            </w:pPr>
+            <w:r>
+              <w:rPr>
+                <w:lang w:eastAsia="de-DE"/>
+              </w:rPr>
+              <w:t xml:space="preserve">Eine Oberfläche für alle Sprachen, bessere User-Experience durch Single Page </w:t>
+            </w:r>
+            <w:proofErr w:type="spellStart"/>
+            <w:r>
+              <w:rPr>
+                <w:lang w:eastAsia="de-DE"/>
+              </w:rPr>
+              <w:t>Application</w:t>
+            </w:r>
+            <w:proofErr w:type="spellEnd"/>
+          </w:p>
+        </w:tc>
+      </w:tr>
+    </w:tbl>
+    <w:p>
+      <w:pPr>
+        <w:rPr>
+          <w:lang w:eastAsia="de-DE"/>
+        </w:rPr>
+      </w:pPr>
     </w:p>
     <w:p>
-      <w:pPr>
-        <w:pStyle w:val="berschrift2"/>
-        <w:rPr>
-          <w:rFonts w:eastAsia="Times New Roman"/>
-          <w:lang w:eastAsia="de-DE"/>
-        </w:rPr>
-      </w:pPr>
-      <w:bookmarkStart w:id="19" w:name="_Toc243560843"/>
-      <w:r>
-        <w:rPr>
-          <w:rFonts w:eastAsia="Times New Roman"/>
-          <w:lang w:eastAsia="de-DE"/>
-        </w:rPr>
-        <w:t>Anwendungsaufbau</w:t>
-      </w:r>
-      <w:bookmarkEnd w:id="19"/>
+      <w:proofErr w:type="spellStart"/>
+      <w:r>
+        <w:t>PHPMailer</w:t>
+      </w:r>
+      <w:proofErr w:type="spellEnd"/>
+      <w:r>
+        <w:t xml:space="preserve"> ist eine serverseitige Bibliothek. Ein reines Frontend kann keine E-Mails versenden, weil dafür SMTP-Zugangsdaten nötig sind, die nicht im Browser liegen dürfen. Deshalb wird trotz fehlendem Backend-Framework ein kleiner serverseitiger PHP-Endpunkt eingesetzt.</w:t>
+      </w:r>
     </w:p>
     <w:p>
       <w:pPr>
-        <w:rPr>
-          <w:lang w:eastAsia="de-DE"/>
-        </w:rPr>
-      </w:pPr>
-      <w:r>
-        <w:rPr>
-          <w:lang w:eastAsia="de-DE"/>
-        </w:rPr>
-        <w:t xml:space="preserve"> (Frontend, Backend, Validierung, Mehrsprachigkeit)</w:t>
+        <w:pStyle w:val="berschrift2"/>
+        <w:rPr>
+          <w:rFonts w:eastAsia="Times New Roman"/>
+          <w:lang w:eastAsia="de-DE"/>
+        </w:rPr>
+      </w:pPr>
+      <w:bookmarkStart w:id="19" w:name="_Toc244076033"/>
+      <w:r>
+        <w:rPr>
+          <w:rFonts w:eastAsia="Times New Roman"/>
+          <w:lang w:eastAsia="de-DE"/>
+        </w:rPr>
+        <w:t>Systemarchitektur</w:t>
+      </w:r>
+      <w:bookmarkEnd w:id="19"/>
+      <w:r>
+        <w:rPr>
+          <w:rFonts w:eastAsia="Times New Roman"/>
+          <w:lang w:eastAsia="de-DE"/>
+        </w:rPr>
+        <w:t xml:space="preserve"> </w:t>
       </w:r>
     </w:p>
     <w:p>
       <w:pPr>
-        <w:pStyle w:val="berschrift1"/>
+        <w:rPr>
+          <w:lang w:eastAsia="de-DE"/>
+        </w:rPr>
+      </w:pPr>
+      <w:r>
+        <w:rPr>
+          <w:lang w:eastAsia="de-DE"/>
+        </w:rPr>
+        <w:t>(Diagramm mit Komponenten, Datenflüssen und Vertrauensgrenzen)</w:t>
+      </w:r>
+    </w:p>
+    <w:p>
+      <w:pPr>
+        <w:pStyle w:val="berschrift2"/>
         <w:rPr>
           <w:rFonts w:eastAsia="Times New Roman"/>
           <w:lang w:eastAsia="de-DE"/>
         </w:rPr>
       </w:pPr>
-      <w:bookmarkStart w:id="20" w:name="_Toc243560844"/>
+      <w:bookmarkStart w:id="20" w:name="_Toc244076034"/>
       <w:r>
         <w:rPr>
           <w:rFonts w:eastAsia="Times New Roman"/>
           <w:lang w:eastAsia="de-DE"/>
         </w:rPr>
-        <w:t>Benutzeroberfläche</w:t>
+        <w:t>Anwendungsaufbau</w:t>
       </w:r>
       <w:bookmarkEnd w:id="20"/>
     </w:p>
     <w:p>
       <w:pPr>
-        <w:pStyle w:val="berschrift2"/>
-        <w:rPr>
-          <w:rFonts w:eastAsia="Times New Roman"/>
-          <w:lang w:eastAsia="de-DE"/>
-        </w:rPr>
-      </w:pPr>
-      <w:bookmarkStart w:id="21" w:name="_Toc243560845"/>
-      <w:r>
-        <w:rPr>
-          <w:rFonts w:eastAsia="Times New Roman"/>
-          <w:lang w:eastAsia="de-DE"/>
-        </w:rPr>
-        <w:t>Entwürfe</w:t>
-      </w:r>
-      <w:bookmarkEnd w:id="21"/>
-      <w:r>
-        <w:rPr>
-          <w:rFonts w:eastAsia="Times New Roman"/>
-          <w:lang w:eastAsia="de-DE"/>
-        </w:rPr>
-        <w:t xml:space="preserve"> </w:t>
+        <w:rPr>
+          <w:lang w:eastAsia="de-DE"/>
+        </w:rPr>
+      </w:pPr>
+      <w:r>
+        <w:rPr>
+          <w:lang w:eastAsia="de-DE"/>
+        </w:rPr>
+        <w:t xml:space="preserve"> (Frontend, Backend, Validierung, Mehrsprachigkeit)</w:t>
       </w:r>
     </w:p>
     <w:p>
       <w:pPr>
-        <w:rPr>
-          <w:lang w:eastAsia="de-DE"/>
-        </w:rPr>
-      </w:pPr>
-      <w:r>
-        <w:rPr>
-          <w:lang w:eastAsia="de-DE"/>
-        </w:rPr>
-        <w:t>(Token-Anfrage, Eingabeformula</w:t>
-      </w:r>
-      <w:bookmarkStart w:id="22" w:name="_GoBack"/>
-      <w:bookmarkEnd w:id="22"/>
-      <w:r>
-        <w:rPr>
-          <w:lang w:eastAsia="de-DE"/>
-        </w:rPr>
-        <w:t>r, Bestätigung)</w:t>
-      </w:r>
+        <w:pStyle w:val="berschrift1"/>
+        <w:rPr>
+          <w:rFonts w:eastAsia="Times New Roman"/>
+          <w:lang w:eastAsia="de-DE"/>
+        </w:rPr>
+      </w:pPr>
+      <w:bookmarkStart w:id="21" w:name="_Toc244076035"/>
+      <w:r>
+        <w:rPr>
+          <w:rFonts w:eastAsia="Times New Roman"/>
+          <w:lang w:eastAsia="de-DE"/>
+        </w:rPr>
+        <w:t>Benutzeroberfläche</w:t>
+      </w:r>
+      <w:bookmarkEnd w:id="21"/>
     </w:p>
     <w:p>
       <w:pPr>
+        <w:pStyle w:val="berschrift2"/>
+        <w:rPr>
+          <w:rFonts w:eastAsia="Times New Roman"/>
+          <w:lang w:eastAsia="de-DE"/>
+        </w:rPr>
+      </w:pPr>
+      <w:bookmarkStart w:id="22" w:name="_Toc244076036"/>
+      <w:r>
+        <w:rPr>
+          <w:rFonts w:eastAsia="Times New Roman"/>
+          <w:lang w:eastAsia="de-DE"/>
+        </w:rPr>
+        <w:t>Entwürfe</w:t>
+      </w:r>
+      <w:bookmarkEnd w:id="22"/>
+      <w:r>
+        <w:rPr>
+          <w:rFonts w:eastAsia="Times New Roman"/>
+          <w:lang w:eastAsia="de-DE"/>
+        </w:rPr>
+        <w:t xml:space="preserve"> </w:t>
+      </w:r>
+    </w:p>
+    <w:p>
+      <w:pPr>
+        <w:rPr>
+          <w:lang w:eastAsia="de-DE"/>
+        </w:rPr>
+      </w:pPr>
+      <w:r>
+        <w:rPr>
+          <w:lang w:eastAsia="de-DE"/>
+        </w:rPr>
+        <w:t>(Token-Anfrage, Eingabeformular, Bestätigung)</w:t>
+      </w:r>
+    </w:p>
+    <w:p>
+      <w:pPr>
         <w:pStyle w:val="berschrift1"/>
         <w:rPr>
           <w:rFonts w:eastAsia="Times New Roman"/>
           <w:lang w:eastAsia="de-DE"/>
         </w:rPr>
       </w:pPr>
-      <w:bookmarkStart w:id="23" w:name="_Toc243560846"/>
+      <w:bookmarkStart w:id="23" w:name="_Toc244076037"/>
       <w:r>
         <w:rPr>
           <w:rFonts w:eastAsia="Times New Roman"/>
@@ -7011,7 +7672,7 @@
           <w:lang w:eastAsia="de-DE"/>
         </w:rPr>
       </w:pPr>
-      <w:bookmarkStart w:id="24" w:name="_Toc243560847"/>
+      <w:bookmarkStart w:id="24" w:name="_Toc244076038"/>
       <w:r>
         <w:rPr>
           <w:rFonts w:eastAsia="Times New Roman"/>
@@ -7049,7 +7710,7 @@
           <w:lang w:eastAsia="de-DE"/>
         </w:rPr>
       </w:pPr>
-      <w:bookmarkStart w:id="25" w:name="_Toc243560848"/>
+      <w:bookmarkStart w:id="25" w:name="_Toc244076039"/>
       <w:r>
         <w:rPr>
           <w:rFonts w:eastAsia="Times New Roman"/>
@@ -7067,7 +7728,7 @@
           <w:lang w:eastAsia="de-DE"/>
         </w:rPr>
       </w:pPr>
-      <w:bookmarkStart w:id="26" w:name="_Toc243560849"/>
+      <w:bookmarkStart w:id="26" w:name="_Toc244076040"/>
       <w:r>
         <w:rPr>
           <w:rFonts w:eastAsia="Times New Roman"/>
@@ -7105,7 +7766,7 @@
           <w:lang w:eastAsia="de-DE"/>
         </w:rPr>
       </w:pPr>
-      <w:bookmarkStart w:id="27" w:name="_Toc243560850"/>
+      <w:bookmarkStart w:id="27" w:name="_Toc244076041"/>
       <w:r>
         <w:rPr>
           <w:rFonts w:eastAsia="Times New Roman"/>
@@ -7124,7 +7785,7 @@
           <w:lang w:eastAsia="de-DE"/>
         </w:rPr>
       </w:pPr>
-      <w:bookmarkStart w:id="28" w:name="_Toc243560851"/>
+      <w:bookmarkStart w:id="28" w:name="_Toc244076042"/>
       <w:r>
         <w:rPr>
           <w:rFonts w:eastAsia="Times New Roman"/>
@@ -7142,7 +7803,7 @@
           <w:lang w:eastAsia="de-DE"/>
         </w:rPr>
       </w:pPr>
-      <w:bookmarkStart w:id="29" w:name="_Toc243560852"/>
+      <w:bookmarkStart w:id="29" w:name="_Toc244076043"/>
       <w:r>
         <w:rPr>
           <w:rFonts w:eastAsia="Times New Roman"/>
@@ -7202,7 +7863,7 @@
           <w:lang w:eastAsia="de-DE"/>
         </w:rPr>
       </w:pPr>
-      <w:bookmarkStart w:id="30" w:name="_Toc243560853"/>
+      <w:bookmarkStart w:id="30" w:name="_Toc244076044"/>
       <w:r>
         <w:rPr>
           <w:lang w:eastAsia="de-DE"/>
@@ -7237,7 +7898,7 @@
           <w:lang w:eastAsia="de-DE"/>
         </w:rPr>
       </w:pPr>
-      <w:bookmarkStart w:id="31" w:name="_Toc243560854"/>
+      <w:bookmarkStart w:id="31" w:name="_Toc244076045"/>
       <w:r>
         <w:rPr>
           <w:rFonts w:eastAsia="Times New Roman"/>
@@ -7255,7 +7916,7 @@
           <w:lang w:eastAsia="de-DE"/>
         </w:rPr>
       </w:pPr>
-      <w:bookmarkStart w:id="32" w:name="_Toc243560855"/>
+      <w:bookmarkStart w:id="32" w:name="_Toc244076046"/>
       <w:r>
         <w:rPr>
           <w:rFonts w:eastAsia="Times New Roman"/>
@@ -7326,7 +7987,6 @@
           <w:docPartUnique/>
         </w:docPartObj>
       </w:sdtPr>
-      <w:sdtEndPr/>
       <w:sdtContent>
         <w:r>
           <w:fldChar w:fldCharType="begin"/>
@@ -7341,7 +8001,7 @@
           <w:rPr>
             <w:noProof/>
           </w:rPr>
-          <w:t>10</w:t>
+          <w:t>2</w:t>
         </w:r>
         <w:r>
           <w:fldChar w:fldCharType="end"/>
@@ -11412,7 +12072,7 @@
 </file>
 
 <file path=customXml/itemProps1.xml><?xml version="1.0" encoding="utf-8"?>
-<ds:datastoreItem xmlns:ds="http://schemas.openxmlformats.org/officeDocument/2006/customXml" ds:itemID="{C76D79FB-06E7-499F-9B92-63B37AACAEE8}">
+<ds:datastoreItem xmlns:ds="http://schemas.openxmlformats.org/officeDocument/2006/customXml" ds:itemID="{E2B932FD-8D4A-49B5-8011-205DA82696AF}">
   <ds:schemaRefs>
     <ds:schemaRef ds:uri="http://schemas.openxmlformats.org/officeDocument/2006/bibliography"/>
   </ds:schemaRefs>

</xml_diff>